<commit_message>
docs: English content for renamed docs
Co-Authored-By: Claude Opus 5.5 <noreply@anthropic.com>
</commit_message>
<xml_diff>
--- a/docs/planning/01_Unistyles_What_Is_Already_Done.docx
+++ b/docs/planning/01_Unistyles_What_Is_Already_Done.docx
@@ -24,7 +24,7 @@
           <w:szCs w:val="20"/>
           <w:rFonts w:ascii="Calibri" w:cs="Calibri" w:eastAsia="Calibri" w:hAnsi="Calibri"/>
         </w:rPr>
-        <w:t xml:space="preserve">DOCUMENTO 1 DE 5</w:t>
+        <w:t>DOCUMENT 1 OF 5</w:t>
       </w:r>
     </w:p>
     <w:p>
@@ -42,7 +42,7 @@
           <w:rFonts w:ascii="Calibri" w:cs="Calibri" w:eastAsia="Calibri" w:hAnsi="Calibri"/>
           <w:spacing w:val="60"/>
         </w:rPr>
-        <w:t xml:space="preserve">UNISTYLES CURAÇAO · E-COMMERCE</w:t>
+        <w:t>UNISTYLES CURAÇAO · E-COMMERCE</w:t>
       </w:r>
     </w:p>
     <w:p>
@@ -59,7 +59,7 @@
           <w:szCs w:val="52"/>
           <w:rFonts w:ascii="Georgia" w:cs="Georgia" w:eastAsia="Georgia" w:hAnsi="Georgia"/>
         </w:rPr>
-        <w:t xml:space="preserve">Lo que ya está listo</w:t>
+        <w:t>What is already done</w:t>
       </w:r>
     </w:p>
     <w:p>
@@ -88,7 +88,7 @@
           <w:szCs w:val="24"/>
           <w:rFonts w:ascii="Calibri" w:cs="Calibri" w:eastAsia="Calibri" w:hAnsi="Calibri"/>
         </w:rPr>
-        <w:t xml:space="preserve">Inventario del estado actual del sitio web (código auditado)</w:t>
+        <w:t>Inventory of the current state of the website (audited code)</w:t>
       </w:r>
     </w:p>
     <w:p>
@@ -105,7 +105,7 @@
           <w:szCs w:val="19"/>
           <w:rFonts w:ascii="Calibri" w:cs="Calibri" w:eastAsia="Calibri" w:hAnsi="Calibri"/>
         </w:rPr>
-        <w:t xml:space="preserve">Preparado para:  </w:t>
+        <w:t>Prepared for:  Paula — Founder, Unistyles Curaçao</w:t>
       </w:r>
       <w:r>
         <w:rPr>
@@ -114,7 +114,6 @@
           <w:szCs w:val="19"/>
           <w:rFonts w:ascii="Calibri" w:cs="Calibri" w:eastAsia="Calibri" w:hAnsi="Calibri"/>
         </w:rPr>
-        <w:t xml:space="preserve">Paula — Fundadora, Unistyles Curaçao</w:t>
       </w:r>
     </w:p>
     <w:p>
@@ -131,7 +130,7 @@
           <w:szCs w:val="19"/>
           <w:rFonts w:ascii="Calibri" w:cs="Calibri" w:eastAsia="Calibri" w:hAnsi="Calibri"/>
         </w:rPr>
-        <w:t xml:space="preserve">Fecha:  </w:t>
+        <w:t>Date:  July 31, 2026</w:t>
       </w:r>
       <w:r>
         <w:rPr>
@@ -140,7 +139,6 @@
           <w:szCs w:val="19"/>
           <w:rFonts w:ascii="Calibri" w:cs="Calibri" w:eastAsia="Calibri" w:hAnsi="Calibri"/>
         </w:rPr>
-        <w:t xml:space="preserve">31 de julio de 2026</w:t>
       </w:r>
     </w:p>
     <w:p>
@@ -157,7 +155,7 @@
           <w:szCs w:val="19"/>
           <w:rFonts w:ascii="Calibri" w:cs="Calibri" w:eastAsia="Calibri" w:hAnsi="Calibri"/>
         </w:rPr>
-        <w:t xml:space="preserve">Alcance:  </w:t>
+        <w:t>Scope:  Frontend · Backend · Delivery · Payments · Database</w:t>
       </w:r>
       <w:r>
         <w:rPr>
@@ -166,7 +164,6 @@
           <w:szCs w:val="19"/>
           <w:rFonts w:ascii="Calibri" w:cs="Calibri" w:eastAsia="Calibri" w:hAnsi="Calibri"/>
         </w:rPr>
-        <w:t xml:space="preserve">Frontend · Backend · Delivery · Pagos · Base de datos</w:t>
       </w:r>
     </w:p>
     <w:p>
@@ -183,7 +180,7 @@
           <w:szCs w:val="19"/>
           <w:rFonts w:ascii="Calibri" w:cs="Calibri" w:eastAsia="Calibri" w:hAnsi="Calibri"/>
         </w:rPr>
-        <w:t xml:space="preserve">Método:  </w:t>
+        <w:t>Method:  In-depth repository audit (deep code research)</w:t>
       </w:r>
       <w:r>
         <w:rPr>
@@ -192,7 +189,6 @@
           <w:szCs w:val="19"/>
           <w:rFonts w:ascii="Calibri" w:cs="Calibri" w:eastAsia="Calibri" w:hAnsi="Calibri"/>
         </w:rPr>
-        <w:t xml:space="preserve">Auditoría profunda del repositorio (deep research de código)</w:t>
       </w:r>
     </w:p>
     <w:p>
@@ -213,7 +209,7 @@
           <w:szCs w:val="28"/>
           <w:rFonts w:ascii="Georgia" w:cs="Georgia" w:eastAsia="Georgia" w:hAnsi="Georgia"/>
         </w:rPr>
-        <w:t xml:space="preserve">Contenido</w:t>
+        <w:t>Contents</w:t>
       </w:r>
     </w:p>
     <w:sdt>
@@ -257,7 +253,7 @@
           <w:szCs w:val="30"/>
           <w:rFonts w:ascii="Georgia" w:cs="Georgia" w:eastAsia="Georgia" w:hAnsi="Georgia"/>
         </w:rPr>
-        <w:t xml:space="preserve">1. Resumen ejecutivo</w:t>
+        <w:t>1. Executive summary</w:t>
       </w:r>
     </w:p>
     <w:p>
@@ -273,7 +269,7 @@
           <w:szCs w:val="22"/>
           <w:rFonts w:ascii="Calibri" w:cs="Calibri" w:eastAsia="Calibri" w:hAnsi="Calibri"/>
         </w:rPr>
-        <w:t xml:space="preserve">En pocas palabras: tienes mucho más construido de lo que crees. El sitio no está empezando desde cero — está aproximadamente al 75–85% del código. El trabajo restante es sobre todo "cerrar cabos": conectar formularios, corregir un par de errores, configurar cuentas externas y definir la parte operativa del delivery.</w:t>
+        <w:t>In short: you have much more built than you think. The site is not starting from scratch — it is roughly 75–85% complete in terms of code. The remaining work is mostly "tying up loose ends": connecting forms, fixing a couple of bugs, configuring external accounts and defining the operational side of delivery.</w:t>
       </w:r>
     </w:p>
     <w:tbl>
@@ -316,7 +312,7 @@
                 <w:szCs w:val="21"/>
                 <w:rFonts w:ascii="Calibri" w:cs="Calibri" w:eastAsia="Calibri" w:hAnsi="Calibri"/>
               </w:rPr>
-              <w:t xml:space="preserve">La foto general</w:t>
+              <w:t>The big picture</w:t>
             </w:r>
           </w:p>
           <w:p>
@@ -330,7 +326,7 @@
                 <w:szCs w:val="20"/>
                 <w:rFonts w:ascii="Calibri" w:cs="Calibri" w:eastAsia="Calibri" w:hAnsi="Calibri"/>
               </w:rPr>
-              <w:t xml:space="preserve">• FRONTEND (lo que ve el cliente): visualmente completo y funcional. 30+ páginas, catálogo real, carrito, checkout de 3 pasos, mapa de delivery.</w:t>
+              <w:t>• FRONTEND (what the customer sees): visually complete and functional. 30+ pages, real catalogue, cart, 3-step checkout, delivery map.</w:t>
             </w:r>
           </w:p>
           <w:p>
@@ -344,7 +340,7 @@
                 <w:szCs w:val="20"/>
                 <w:rFonts w:ascii="Calibri" w:cs="Calibri" w:eastAsia="Calibri" w:hAnsi="Calibri"/>
               </w:rPr>
-              <w:t xml:space="preserve">• BACKEND (el motor invisible): a nivel producción. Autenticación segura, órdenes con transacciones, pagos Sentoo reales, chatbot de WhatsApp completo.</w:t>
+              <w:t>• BACKEND (the invisible engine): production-grade. Secure authentication, transactional orders, real Sentoo payments, complete WhatsApp chatbot.</w:t>
             </w:r>
           </w:p>
           <w:p>
@@ -358,7 +354,7 @@
                 <w:szCs w:val="20"/>
                 <w:rFonts w:ascii="Calibri" w:cs="Calibri" w:eastAsia="Calibri" w:hAnsi="Calibri"/>
               </w:rPr>
-              <w:t xml:space="preserve">• DELIVERY: mucho más avanzado de lo que pensabas — 3 zonas de Curaçao con mapa, auto-detección por GPS, cálculo de tarifas y envío gratis por zona.</w:t>
+              <w:t>• DELIVERY: much more advanced than you thought — 3 Curaçao zones with a map, GPS auto-detection, fee calculation and free shipping per zone.</w:t>
             </w:r>
           </w:p>
           <w:p>
@@ -372,7 +368,7 @@
                 <w:szCs w:val="20"/>
                 <w:rFonts w:ascii="Calibri" w:cs="Calibri" w:eastAsia="Calibri" w:hAnsi="Calibri"/>
               </w:rPr>
-              <w:t xml:space="preserve">• LO QUE FALTA: se detalla en el Documento 2 (checklist de finalización). Son piezas concretas, no una reconstrucción.</w:t>
+              <w:t>• WHAT IS MISSING: detailed in Document 2 (completion checklist). These are concrete pieces, not a rebuild.</w:t>
             </w:r>
           </w:p>
         </w:tc>
@@ -400,7 +396,7 @@
           <w:szCs w:val="22"/>
           <w:rFonts w:ascii="Calibri" w:cs="Calibri" w:eastAsia="Calibri" w:hAnsi="Calibri"/>
         </w:rPr>
-        <w:t xml:space="preserve">¿Qué significan las etiquetas de estado?</w:t>
+        <w:t>What do the status labels mean?</w:t>
       </w:r>
     </w:p>
     <w:tbl>
@@ -448,7 +444,7 @@
                 <w:szCs w:val="18"/>
                 <w:rFonts w:ascii="Calibri" w:cs="Calibri" w:eastAsia="Calibri" w:hAnsi="Calibri"/>
               </w:rPr>
-              <w:t xml:space="preserve">Etiqueta</w:t>
+              <w:t>Label</w:t>
             </w:r>
           </w:p>
         </w:tc>
@@ -477,7 +473,7 @@
                 <w:szCs w:val="18"/>
                 <w:rFonts w:ascii="Calibri" w:cs="Calibri" w:eastAsia="Calibri" w:hAnsi="Calibri"/>
               </w:rPr>
-              <w:t xml:space="preserve">Significado</w:t>
+              <w:t>Meaning</w:t>
             </w:r>
           </w:p>
         </w:tc>
@@ -508,7 +504,7 @@
                 <w:szCs w:val="18"/>
                 <w:rFonts w:ascii="Calibri" w:cs="Calibri" w:eastAsia="Calibri" w:hAnsi="Calibri"/>
               </w:rPr>
-              <w:t xml:space="preserve">LISTO</w:t>
+              <w:t>READY</w:t>
             </w:r>
           </w:p>
         </w:tc>
@@ -537,7 +533,7 @@
                 <w:szCs w:val="18"/>
                 <w:rFonts w:ascii="Calibri" w:cs="Calibri" w:eastAsia="Calibri" w:hAnsi="Calibri"/>
               </w:rPr>
-              <w:t xml:space="preserve">Funciona hoy. Construido y operativo.</w:t>
+              <w:t>Works today. Built and operational.</w:t>
             </w:r>
           </w:p>
         </w:tc>
@@ -568,7 +564,7 @@
                 <w:szCs w:val="18"/>
                 <w:rFonts w:ascii="Calibri" w:cs="Calibri" w:eastAsia="Calibri" w:hAnsi="Calibri"/>
               </w:rPr>
-              <w:t xml:space="preserve">PARCIAL</w:t>
+              <w:t>PARTIAL</w:t>
             </w:r>
           </w:p>
         </w:tc>
@@ -597,7 +593,7 @@
                 <w:szCs w:val="18"/>
                 <w:rFonts w:ascii="Calibri" w:cs="Calibri" w:eastAsia="Calibri" w:hAnsi="Calibri"/>
               </w:rPr>
-              <w:t xml:space="preserve">Construido pero necesita conexión, configuración o datos para funcionar del todo.</w:t>
+              <w:t>Built but needs connection, configuration or data to work fully.</w:t>
             </w:r>
           </w:p>
         </w:tc>
@@ -628,7 +624,7 @@
                 <w:szCs w:val="18"/>
                 <w:rFonts w:ascii="Calibri" w:cs="Calibri" w:eastAsia="Calibri" w:hAnsi="Calibri"/>
               </w:rPr>
-              <w:t xml:space="preserve">FALTA</w:t>
+              <w:t>MISSING</w:t>
             </w:r>
           </w:p>
         </w:tc>
@@ -657,7 +653,7 @@
                 <w:szCs w:val="18"/>
                 <w:rFonts w:ascii="Calibri" w:cs="Calibri" w:eastAsia="Calibri" w:hAnsi="Calibri"/>
               </w:rPr>
-              <w:t xml:space="preserve">Todavía no existe / hay que hacerlo.</w:t>
+              <w:t>Does not exist yet / needs to be done.</w:t>
             </w:r>
           </w:p>
         </w:tc>
@@ -685,7 +681,7 @@
           <w:szCs w:val="30"/>
           <w:rFonts w:ascii="Georgia" w:cs="Georgia" w:eastAsia="Georgia" w:hAnsi="Georgia"/>
         </w:rPr>
-        <w:t xml:space="preserve">2. Arquitectura y tecnología (en simple)</w:t>
+        <w:t>2. Architecture and technology (in simple terms)</w:t>
       </w:r>
     </w:p>
     <w:p>
@@ -704,7 +700,7 @@
           <w:szCs w:val="21"/>
           <w:rFonts w:ascii="Calibri" w:cs="Calibri" w:eastAsia="Calibri" w:hAnsi="Calibri"/>
         </w:rPr>
-        <w:t xml:space="preserve">Tu sitio está construido con tecnología moderna y estándar de la industria. No es una plantilla de arrastrar-y-soltar: es una tienda a medida con tres piezas que trabajan juntas.</w:t>
+        <w:t>Your site is built with modern, industry-standard technology. It is not a drag-and-drop template: it is a custom store made of three pieces that work together.</w:t>
       </w:r>
     </w:p>
     <w:tbl>
@@ -754,7 +750,7 @@
                 <w:szCs w:val="18"/>
                 <w:rFonts w:ascii="Calibri" w:cs="Calibri" w:eastAsia="Calibri" w:hAnsi="Calibri"/>
               </w:rPr>
-              <w:t xml:space="preserve">Pieza</w:t>
+              <w:t>Component</w:t>
             </w:r>
           </w:p>
         </w:tc>
@@ -783,7 +779,7 @@
                 <w:szCs w:val="18"/>
                 <w:rFonts w:ascii="Calibri" w:cs="Calibri" w:eastAsia="Calibri" w:hAnsi="Calibri"/>
               </w:rPr>
-              <w:t xml:space="preserve">Qué es</w:t>
+              <w:t>What it is</w:t>
             </w:r>
           </w:p>
         </w:tc>
@@ -812,7 +808,7 @@
                 <w:szCs w:val="18"/>
                 <w:rFonts w:ascii="Calibri" w:cs="Calibri" w:eastAsia="Calibri" w:hAnsi="Calibri"/>
               </w:rPr>
-              <w:t xml:space="preserve">Para qué sirve</w:t>
+              <w:t>What it is for</w:t>
             </w:r>
           </w:p>
         </w:tc>
@@ -841,7 +837,7 @@
                 <w:szCs w:val="18"/>
                 <w:rFonts w:ascii="Calibri" w:cs="Calibri" w:eastAsia="Calibri" w:hAnsi="Calibri"/>
               </w:rPr>
-              <w:t xml:space="preserve">Estado</w:t>
+              <w:t>Status</w:t>
             </w:r>
           </w:p>
         </w:tc>
@@ -872,7 +868,7 @@
                 <w:szCs w:val="18"/>
                 <w:rFonts w:ascii="Calibri" w:cs="Calibri" w:eastAsia="Calibri" w:hAnsi="Calibri"/>
               </w:rPr>
-              <w:t xml:space="preserve">Frontend (React + Vite)</w:t>
+              <w:t>Frontend (React + Vite)</w:t>
             </w:r>
           </w:p>
         </w:tc>
@@ -901,7 +897,7 @@
                 <w:szCs w:val="18"/>
                 <w:rFonts w:ascii="Calibri" w:cs="Calibri" w:eastAsia="Calibri" w:hAnsi="Calibri"/>
               </w:rPr>
-              <w:t xml:space="preserve">La tienda que ve el cliente</w:t>
+              <w:t>The store the customer sees</w:t>
             </w:r>
           </w:p>
         </w:tc>
@@ -930,7 +926,7 @@
                 <w:szCs w:val="18"/>
                 <w:rFonts w:ascii="Calibri" w:cs="Calibri" w:eastAsia="Calibri" w:hAnsi="Calibri"/>
               </w:rPr>
-              <w:t xml:space="preserve">Páginas, catálogo, carrito, checkout, mapa</w:t>
+              <w:t>Pages, catalogue, cart, checkout, map</w:t>
             </w:r>
           </w:p>
         </w:tc>
@@ -959,7 +955,7 @@
                 <w:szCs w:val="18"/>
                 <w:rFonts w:ascii="Calibri" w:cs="Calibri" w:eastAsia="Calibri" w:hAnsi="Calibri"/>
               </w:rPr>
-              <w:t xml:space="preserve">LISTO</w:t>
+              <w:t>READY</w:t>
             </w:r>
           </w:p>
         </w:tc>
@@ -990,7 +986,7 @@
                 <w:szCs w:val="18"/>
                 <w:rFonts w:ascii="Calibri" w:cs="Calibri" w:eastAsia="Calibri" w:hAnsi="Calibri"/>
               </w:rPr>
-              <w:t xml:space="preserve">Backend (Node/Express)</w:t>
+              <w:t>Backend (Node/Express)</w:t>
             </w:r>
           </w:p>
         </w:tc>
@@ -1019,7 +1015,7 @@
                 <w:szCs w:val="18"/>
                 <w:rFonts w:ascii="Calibri" w:cs="Calibri" w:eastAsia="Calibri" w:hAnsi="Calibri"/>
               </w:rPr>
-              <w:t xml:space="preserve">El motor invisible</w:t>
+              <w:t>The invisible engine</w:t>
             </w:r>
           </w:p>
         </w:tc>
@@ -1048,7 +1044,7 @@
                 <w:szCs w:val="18"/>
                 <w:rFonts w:ascii="Calibri" w:cs="Calibri" w:eastAsia="Calibri" w:hAnsi="Calibri"/>
               </w:rPr>
-              <w:t xml:space="preserve">Cuentas, órdenes, pagos, WhatsApp, admin</w:t>
+              <w:t>Accounts, orders, payments, WhatsApp, admin</w:t>
             </w:r>
           </w:p>
         </w:tc>
@@ -1077,7 +1073,7 @@
                 <w:szCs w:val="18"/>
                 <w:rFonts w:ascii="Calibri" w:cs="Calibri" w:eastAsia="Calibri" w:hAnsi="Calibri"/>
               </w:rPr>
-              <w:t xml:space="preserve">LISTO</w:t>
+              <w:t>READY</w:t>
             </w:r>
           </w:p>
         </w:tc>
@@ -1108,7 +1104,7 @@
                 <w:szCs w:val="18"/>
                 <w:rFonts w:ascii="Calibri" w:cs="Calibri" w:eastAsia="Calibri" w:hAnsi="Calibri"/>
               </w:rPr>
-              <w:t xml:space="preserve">Directus (CMS)</w:t>
+              <w:t>Directus (CMS)</w:t>
             </w:r>
           </w:p>
         </w:tc>
@@ -1137,7 +1133,7 @@
                 <w:szCs w:val="18"/>
                 <w:rFonts w:ascii="Calibri" w:cs="Calibri" w:eastAsia="Calibri" w:hAnsi="Calibri"/>
               </w:rPr>
-              <w:t xml:space="preserve">Panel de contenido</w:t>
+              <w:t>Content panel</w:t>
             </w:r>
           </w:p>
         </w:tc>
@@ -1166,7 +1162,7 @@
                 <w:szCs w:val="18"/>
                 <w:rFonts w:ascii="Calibri" w:cs="Calibri" w:eastAsia="Calibri" w:hAnsi="Calibri"/>
               </w:rPr>
-              <w:t xml:space="preserve">Editar productos, categorías, marcas sin código</w:t>
+              <w:t>Edit products, categories, brands without code</w:t>
             </w:r>
           </w:p>
         </w:tc>
@@ -1195,7 +1191,7 @@
                 <w:szCs w:val="18"/>
                 <w:rFonts w:ascii="Calibri" w:cs="Calibri" w:eastAsia="Calibri" w:hAnsi="Calibri"/>
               </w:rPr>
-              <w:t xml:space="preserve">LISTO</w:t>
+              <w:t>READY</w:t>
             </w:r>
           </w:p>
         </w:tc>
@@ -1226,7 +1222,7 @@
                 <w:szCs w:val="18"/>
                 <w:rFonts w:ascii="Calibri" w:cs="Calibri" w:eastAsia="Calibri" w:hAnsi="Calibri"/>
               </w:rPr>
-              <w:t xml:space="preserve">PostgreSQL</w:t>
+              <w:t>PostgreSQL</w:t>
             </w:r>
           </w:p>
         </w:tc>
@@ -1255,7 +1251,7 @@
                 <w:szCs w:val="18"/>
                 <w:rFonts w:ascii="Calibri" w:cs="Calibri" w:eastAsia="Calibri" w:hAnsi="Calibri"/>
               </w:rPr>
-              <w:t xml:space="preserve">La base de datos</w:t>
+              <w:t>The database</w:t>
             </w:r>
           </w:p>
         </w:tc>
@@ -1284,7 +1280,7 @@
                 <w:szCs w:val="18"/>
                 <w:rFonts w:ascii="Calibri" w:cs="Calibri" w:eastAsia="Calibri" w:hAnsi="Calibri"/>
               </w:rPr>
-              <w:t xml:space="preserve">Guarda productos, órdenes, clientes</w:t>
+              <w:t>Stores products, orders, customers</w:t>
             </w:r>
           </w:p>
         </w:tc>
@@ -1313,7 +1309,7 @@
                 <w:szCs w:val="18"/>
                 <w:rFonts w:ascii="Calibri" w:cs="Calibri" w:eastAsia="Calibri" w:hAnsi="Calibri"/>
               </w:rPr>
-              <w:t xml:space="preserve">LISTO</w:t>
+              <w:t>READY</w:t>
             </w:r>
           </w:p>
         </w:tc>
@@ -1344,7 +1340,7 @@
                 <w:szCs w:val="18"/>
                 <w:rFonts w:ascii="Calibri" w:cs="Calibri" w:eastAsia="Calibri" w:hAnsi="Calibri"/>
               </w:rPr>
-              <w:t xml:space="preserve">Redis</w:t>
+              <w:t>Redis</w:t>
             </w:r>
           </w:p>
         </w:tc>
@@ -1373,7 +1369,7 @@
                 <w:szCs w:val="18"/>
                 <w:rFonts w:ascii="Calibri" w:cs="Calibri" w:eastAsia="Calibri" w:hAnsi="Calibri"/>
               </w:rPr>
-              <w:t xml:space="preserve">Memoria rápida</w:t>
+              <w:t>Fast memory</w:t>
             </w:r>
           </w:p>
         </w:tc>
@@ -1402,7 +1398,7 @@
                 <w:szCs w:val="18"/>
                 <w:rFonts w:ascii="Calibri" w:cs="Calibri" w:eastAsia="Calibri" w:hAnsi="Calibri"/>
               </w:rPr>
-              <w:t xml:space="preserve">Carritos de invitados, sesiones</w:t>
+              <w:t>Guest carts, sessions</w:t>
             </w:r>
           </w:p>
         </w:tc>
@@ -1431,7 +1427,7 @@
                 <w:szCs w:val="18"/>
                 <w:rFonts w:ascii="Calibri" w:cs="Calibri" w:eastAsia="Calibri" w:hAnsi="Calibri"/>
               </w:rPr>
-              <w:t xml:space="preserve">LISTO</w:t>
+              <w:t>READY</w:t>
             </w:r>
           </w:p>
         </w:tc>
@@ -1462,7 +1458,7 @@
                 <w:szCs w:val="18"/>
                 <w:rFonts w:ascii="Calibri" w:cs="Calibri" w:eastAsia="Calibri" w:hAnsi="Calibri"/>
               </w:rPr>
-              <w:t xml:space="preserve">Coolify</w:t>
+              <w:t>Coolify</w:t>
             </w:r>
           </w:p>
         </w:tc>
@@ -1491,7 +1487,7 @@
                 <w:szCs w:val="18"/>
                 <w:rFonts w:ascii="Calibri" w:cs="Calibri" w:eastAsia="Calibri" w:hAnsi="Calibri"/>
               </w:rPr>
-              <w:t xml:space="preserve">El hosting (servidor)</w:t>
+              <w:t>The hosting (server)</w:t>
             </w:r>
           </w:p>
         </w:tc>
@@ -1520,7 +1516,7 @@
                 <w:szCs w:val="18"/>
                 <w:rFonts w:ascii="Calibri" w:cs="Calibri" w:eastAsia="Calibri" w:hAnsi="Calibri"/>
               </w:rPr>
-              <w:t xml:space="preserve">Publica todo en internet con SSL</w:t>
+              <w:t>Publishes everything online with SSL</w:t>
             </w:r>
           </w:p>
         </w:tc>
@@ -1549,7 +1545,7 @@
                 <w:szCs w:val="18"/>
                 <w:rFonts w:ascii="Calibri" w:cs="Calibri" w:eastAsia="Calibri" w:hAnsi="Calibri"/>
               </w:rPr>
-              <w:t xml:space="preserve">EN PROCESO</w:t>
+              <w:t>IN PROGRESS</w:t>
             </w:r>
           </w:p>
         </w:tc>
@@ -1603,7 +1599,7 @@
                 <w:szCs w:val="21"/>
                 <w:rFonts w:ascii="Calibri" w:cs="Calibri" w:eastAsia="Calibri" w:hAnsi="Calibri"/>
               </w:rPr>
-              <w:t xml:space="preserve">Dato clave sobre el hosting</w:t>
+              <w:t>Key fact about hosting</w:t>
             </w:r>
           </w:p>
           <w:p>
@@ -1617,7 +1613,7 @@
                 <w:szCs w:val="20"/>
                 <w:rFonts w:ascii="Calibri" w:cs="Calibri" w:eastAsia="Calibri" w:hAnsi="Calibri"/>
               </w:rPr>
-              <w:t xml:space="preserve">El sitio necesita que TRES servicios estén publicados juntos en Coolify: la tienda (frontend), el motor (backend) y el CMS (Directus). Si solo se publica Directus, el cliente podrá VER productos pero NO podrá comprar, iniciar sesión ni pagar. Confirmar que el backend esté desplegado y accesible es la prioridad #1 técnica antes del lanzamiento.</w:t>
+              <w:t>The site needs THREE services to be published together on Coolify: the store (frontend), the engine (backend) and the CMS (Directus). If only Directus is published, customers will be able to SEE products but will NOT be able to buy, log in or pay. Confirming that the backend is deployed and accessible is the #1 technical priority before launch.</w:t>
             </w:r>
           </w:p>
         </w:tc>
@@ -1645,7 +1641,7 @@
           <w:szCs w:val="30"/>
           <w:rFonts w:ascii="Georgia" w:cs="Georgia" w:eastAsia="Georgia" w:hAnsi="Georgia"/>
         </w:rPr>
-        <w:t xml:space="preserve">3. Frontend — páginas que ve el cliente</w:t>
+        <w:t>3. Frontend — pages the customer sees</w:t>
       </w:r>
     </w:p>
     <w:p>
@@ -1664,7 +1660,7 @@
           <w:szCs w:val="21"/>
           <w:rFonts w:ascii="Calibri" w:cs="Calibri" w:eastAsia="Calibri" w:hAnsi="Calibri"/>
         </w:rPr>
-        <w:t xml:space="preserve">Más de 30 páginas construidas. El recorrido de compra (ver catálogo → producto → carrito → WhatsApp/checkout) es sólido y usa datos reales del catálogo.</w:t>
+        <w:t>More than 30 pages built. The purchase journey (browse catalogue → product → cart → WhatsApp/checkout) is solid and uses real catalogue data.</w:t>
       </w:r>
     </w:p>
     <w:p>
@@ -1681,7 +1677,7 @@
           <w:szCs w:val="25"/>
           <w:rFonts w:ascii="Georgia" w:cs="Georgia" w:eastAsia="Georgia" w:hAnsi="Georgia"/>
         </w:rPr>
-        <w:t xml:space="preserve">3.1 Catálogo y producto</w:t>
+        <w:t>3.1 Catalogue and product</w:t>
       </w:r>
     </w:p>
     <w:tbl>
@@ -1731,7 +1727,7 @@
                 <w:szCs w:val="18"/>
                 <w:rFonts w:ascii="Calibri" w:cs="Calibri" w:eastAsia="Calibri" w:hAnsi="Calibri"/>
               </w:rPr>
-              <w:t xml:space="preserve">Página</w:t>
+              <w:t>Page</w:t>
             </w:r>
           </w:p>
         </w:tc>
@@ -1760,7 +1756,7 @@
                 <w:szCs w:val="18"/>
                 <w:rFonts w:ascii="Calibri" w:cs="Calibri" w:eastAsia="Calibri" w:hAnsi="Calibri"/>
               </w:rPr>
-              <w:t xml:space="preserve">Ruta</w:t>
+              <w:t>Route</w:t>
             </w:r>
           </w:p>
         </w:tc>
@@ -1789,7 +1785,7 @@
                 <w:szCs w:val="18"/>
                 <w:rFonts w:ascii="Calibri" w:cs="Calibri" w:eastAsia="Calibri" w:hAnsi="Calibri"/>
               </w:rPr>
-              <w:t xml:space="preserve">Estado</w:t>
+              <w:t>Status</w:t>
             </w:r>
           </w:p>
         </w:tc>
@@ -1818,7 +1814,7 @@
                 <w:szCs w:val="18"/>
                 <w:rFonts w:ascii="Calibri" w:cs="Calibri" w:eastAsia="Calibri" w:hAnsi="Calibri"/>
               </w:rPr>
-              <w:t xml:space="preserve">Notas</w:t>
+              <w:t>Notes</w:t>
             </w:r>
           </w:p>
         </w:tc>
@@ -1849,7 +1845,7 @@
                 <w:szCs w:val="18"/>
                 <w:rFonts w:ascii="Calibri" w:cs="Calibri" w:eastAsia="Calibri" w:hAnsi="Calibri"/>
               </w:rPr>
-              <w:t xml:space="preserve">Inicio (Home)</w:t>
+              <w:t>Home</w:t>
             </w:r>
           </w:p>
         </w:tc>
@@ -1878,7 +1874,7 @@
                 <w:szCs w:val="18"/>
                 <w:rFonts w:ascii="Calibri" w:cs="Calibri" w:eastAsia="Calibri" w:hAnsi="Calibri"/>
               </w:rPr>
-              <w:t xml:space="preserve">/</w:t>
+              <w:t>/</w:t>
             </w:r>
           </w:p>
         </w:tc>
@@ -1907,7 +1903,7 @@
                 <w:szCs w:val="18"/>
                 <w:rFonts w:ascii="Calibri" w:cs="Calibri" w:eastAsia="Calibri" w:hAnsi="Calibri"/>
               </w:rPr>
-              <w:t xml:space="preserve">LISTO</w:t>
+              <w:t>READY</w:t>
             </w:r>
           </w:p>
         </w:tc>
@@ -1936,7 +1932,7 @@
                 <w:szCs w:val="18"/>
                 <w:rFonts w:ascii="Calibri" w:cs="Calibri" w:eastAsia="Calibri" w:hAnsi="Calibri"/>
               </w:rPr>
-              <w:t xml:space="preserve">Hero, carrusel, categorías, marcas — datos reales del CMS</w:t>
+              <w:t>Hero, carousel, categories, brands — real CMS data</w:t>
             </w:r>
           </w:p>
         </w:tc>
@@ -1967,7 +1963,7 @@
                 <w:szCs w:val="18"/>
                 <w:rFonts w:ascii="Calibri" w:cs="Calibri" w:eastAsia="Calibri" w:hAnsi="Calibri"/>
               </w:rPr>
-              <w:t xml:space="preserve">Bras / Panties / Shapewear</w:t>
+              <w:t>Bras / Panties / Shapewear</w:t>
             </w:r>
           </w:p>
         </w:tc>
@@ -1996,7 +1992,7 @@
                 <w:szCs w:val="18"/>
                 <w:rFonts w:ascii="Calibri" w:cs="Calibri" w:eastAsia="Calibri" w:hAnsi="Calibri"/>
               </w:rPr>
-              <w:t xml:space="preserve">/bras …</w:t>
+              <w:t>/bras …</w:t>
             </w:r>
           </w:p>
         </w:tc>
@@ -2025,7 +2021,7 @@
                 <w:szCs w:val="18"/>
                 <w:rFonts w:ascii="Calibri" w:cs="Calibri" w:eastAsia="Calibri" w:hAnsi="Calibri"/>
               </w:rPr>
-              <w:t xml:space="preserve">LISTO</w:t>
+              <w:t>READY</w:t>
             </w:r>
           </w:p>
         </w:tc>
@@ -2054,7 +2050,7 @@
                 <w:szCs w:val="18"/>
                 <w:rFonts w:ascii="Calibri" w:cs="Calibri" w:eastAsia="Calibri" w:hAnsi="Calibri"/>
               </w:rPr>
-              <w:t xml:space="preserve">Página de categoría con datos reales</w:t>
+              <w:t>Category page with real data</w:t>
             </w:r>
           </w:p>
         </w:tc>
@@ -2085,7 +2081,7 @@
                 <w:szCs w:val="18"/>
                 <w:rFonts w:ascii="Calibri" w:cs="Calibri" w:eastAsia="Calibri" w:hAnsi="Calibri"/>
               </w:rPr>
-              <w:t xml:space="preserve">Perfumes</w:t>
+              <w:t>Perfumes</w:t>
             </w:r>
           </w:p>
         </w:tc>
@@ -2114,7 +2110,7 @@
                 <w:szCs w:val="18"/>
                 <w:rFonts w:ascii="Calibri" w:cs="Calibri" w:eastAsia="Calibri" w:hAnsi="Calibri"/>
               </w:rPr>
-              <w:t xml:space="preserve">/perfume</w:t>
+              <w:t>/perfume</w:t>
             </w:r>
           </w:p>
         </w:tc>
@@ -2143,7 +2139,7 @@
                 <w:szCs w:val="18"/>
                 <w:rFonts w:ascii="Calibri" w:cs="Calibri" w:eastAsia="Calibri" w:hAnsi="Calibri"/>
               </w:rPr>
-              <w:t xml:space="preserve">LISTO</w:t>
+              <w:t>READY</w:t>
             </w:r>
           </w:p>
         </w:tc>
@@ -2172,7 +2168,7 @@
                 <w:szCs w:val="18"/>
                 <w:rFonts w:ascii="Calibri" w:cs="Calibri" w:eastAsia="Calibri" w:hAnsi="Calibri"/>
               </w:rPr>
-              <w:t xml:space="preserve">Incluye quiz de fragancia funcional</w:t>
+              <w:t>Includes a working fragrance quiz</w:t>
             </w:r>
           </w:p>
         </w:tc>
@@ -2203,7 +2199,7 @@
                 <w:szCs w:val="18"/>
                 <w:rFonts w:ascii="Calibri" w:cs="Calibri" w:eastAsia="Calibri" w:hAnsi="Calibri"/>
               </w:rPr>
-              <w:t xml:space="preserve">Cremas / Bloqueador / Desodorantes / Limpieza facial</w:t>
+              <w:t>Creams / Sunscreen / Deodorants / Facial cleansing</w:t>
             </w:r>
           </w:p>
         </w:tc>
@@ -2232,7 +2228,7 @@
                 <w:szCs w:val="18"/>
                 <w:rFonts w:ascii="Calibri" w:cs="Calibri" w:eastAsia="Calibri" w:hAnsi="Calibri"/>
               </w:rPr>
-              <w:t xml:space="preserve">/cremas …</w:t>
+              <w:t>/cremas …</w:t>
             </w:r>
           </w:p>
         </w:tc>
@@ -2261,7 +2257,7 @@
                 <w:szCs w:val="18"/>
                 <w:rFonts w:ascii="Calibri" w:cs="Calibri" w:eastAsia="Calibri" w:hAnsi="Calibri"/>
               </w:rPr>
-              <w:t xml:space="preserve">LISTO</w:t>
+              <w:t>READY</w:t>
             </w:r>
           </w:p>
         </w:tc>
@@ -2290,7 +2286,7 @@
                 <w:szCs w:val="18"/>
                 <w:rFonts w:ascii="Calibri" w:cs="Calibri" w:eastAsia="Calibri" w:hAnsi="Calibri"/>
               </w:rPr>
-              <w:t xml:space="preserve">Datos reales</w:t>
+              <w:t>Real data</w:t>
             </w:r>
           </w:p>
         </w:tc>
@@ -2321,7 +2317,7 @@
                 <w:szCs w:val="18"/>
                 <w:rFonts w:ascii="Calibri" w:cs="Calibri" w:eastAsia="Calibri" w:hAnsi="Calibri"/>
               </w:rPr>
-              <w:t xml:space="preserve">Accesorios</w:t>
+              <w:t>Accessories</w:t>
             </w:r>
           </w:p>
         </w:tc>
@@ -2350,7 +2346,7 @@
                 <w:szCs w:val="18"/>
                 <w:rFonts w:ascii="Calibri" w:cs="Calibri" w:eastAsia="Calibri" w:hAnsi="Calibri"/>
               </w:rPr>
-              <w:t xml:space="preserve">/accesorios</w:t>
+              <w:t>/accesorios</w:t>
             </w:r>
           </w:p>
         </w:tc>
@@ -2379,7 +2375,7 @@
                 <w:szCs w:val="18"/>
                 <w:rFonts w:ascii="Calibri" w:cs="Calibri" w:eastAsia="Calibri" w:hAnsi="Calibri"/>
               </w:rPr>
-              <w:t xml:space="preserve">LISTO</w:t>
+              <w:t>READY</w:t>
             </w:r>
           </w:p>
         </w:tc>
@@ -2408,7 +2404,7 @@
                 <w:szCs w:val="18"/>
                 <w:rFonts w:ascii="Calibri" w:cs="Calibri" w:eastAsia="Calibri" w:hAnsi="Calibri"/>
               </w:rPr>
-              <w:t xml:space="preserve">Datos reales</w:t>
+              <w:t>Real data</w:t>
             </w:r>
           </w:p>
         </w:tc>
@@ -2439,7 +2435,7 @@
                 <w:szCs w:val="18"/>
                 <w:rFonts w:ascii="Calibri" w:cs="Calibri" w:eastAsia="Calibri" w:hAnsi="Calibri"/>
               </w:rPr>
-              <w:t xml:space="preserve">Detalle de producto</w:t>
+              <w:t>Product detail</w:t>
             </w:r>
           </w:p>
         </w:tc>
@@ -2468,7 +2464,7 @@
                 <w:szCs w:val="18"/>
                 <w:rFonts w:ascii="Calibri" w:cs="Calibri" w:eastAsia="Calibri" w:hAnsi="Calibri"/>
               </w:rPr>
-              <w:t xml:space="preserve">/product/:id</w:t>
+              <w:t>/product/:id</w:t>
             </w:r>
           </w:p>
         </w:tc>
@@ -2497,7 +2493,7 @@
                 <w:szCs w:val="18"/>
                 <w:rFonts w:ascii="Calibri" w:cs="Calibri" w:eastAsia="Calibri" w:hAnsi="Calibri"/>
               </w:rPr>
-              <w:t xml:space="preserve">LISTO</w:t>
+              <w:t>READY</w:t>
             </w:r>
           </w:p>
         </w:tc>
@@ -2526,7 +2522,7 @@
                 <w:szCs w:val="18"/>
                 <w:rFonts w:ascii="Calibri" w:cs="Calibri" w:eastAsia="Calibri" w:hAnsi="Calibri"/>
               </w:rPr>
-              <w:t xml:space="preserve">Reseñas conectadas; tallas/colores</w:t>
+              <w:t>Reviews connected; sizes/colours</w:t>
             </w:r>
           </w:p>
         </w:tc>
@@ -2557,7 +2553,7 @@
                 <w:szCs w:val="18"/>
                 <w:rFonts w:ascii="Calibri" w:cs="Calibri" w:eastAsia="Calibri" w:hAnsi="Calibri"/>
               </w:rPr>
-              <w:t xml:space="preserve">Marca</w:t>
+              <w:t>Brand</w:t>
             </w:r>
           </w:p>
         </w:tc>
@@ -2586,7 +2582,7 @@
                 <w:szCs w:val="18"/>
                 <w:rFonts w:ascii="Calibri" w:cs="Calibri" w:eastAsia="Calibri" w:hAnsi="Calibri"/>
               </w:rPr>
-              <w:t xml:space="preserve">/brand/:id</w:t>
+              <w:t>/brand/:id</w:t>
             </w:r>
           </w:p>
         </w:tc>
@@ -2615,7 +2611,7 @@
                 <w:szCs w:val="18"/>
                 <w:rFonts w:ascii="Calibri" w:cs="Calibri" w:eastAsia="Calibri" w:hAnsi="Calibri"/>
               </w:rPr>
-              <w:t xml:space="preserve">PARCIAL</w:t>
+              <w:t>PARTIAL</w:t>
             </w:r>
           </w:p>
         </w:tc>
@@ -2644,7 +2640,7 @@
                 <w:szCs w:val="18"/>
                 <w:rFonts w:ascii="Calibri" w:cs="Calibri" w:eastAsia="Calibri" w:hAnsi="Calibri"/>
               </w:rPr>
-              <w:t xml:space="preserve">Solo 5 marcas definidas manualmente</w:t>
+              <w:t>Only 5 brands defined manually</w:t>
             </w:r>
           </w:p>
         </w:tc>
@@ -2675,7 +2671,7 @@
                 <w:szCs w:val="18"/>
                 <w:rFonts w:ascii="Calibri" w:cs="Calibri" w:eastAsia="Calibri" w:hAnsi="Calibri"/>
               </w:rPr>
-              <w:t xml:space="preserve">Búsqueda</w:t>
+              <w:t>Search</w:t>
             </w:r>
           </w:p>
         </w:tc>
@@ -2704,7 +2700,7 @@
                 <w:szCs w:val="18"/>
                 <w:rFonts w:ascii="Calibri" w:cs="Calibri" w:eastAsia="Calibri" w:hAnsi="Calibri"/>
               </w:rPr>
-              <w:t xml:space="preserve">/search</w:t>
+              <w:t>/search</w:t>
             </w:r>
           </w:p>
         </w:tc>
@@ -2733,7 +2729,7 @@
                 <w:szCs w:val="18"/>
                 <w:rFonts w:ascii="Calibri" w:cs="Calibri" w:eastAsia="Calibri" w:hAnsi="Calibri"/>
               </w:rPr>
-              <w:t xml:space="preserve">LISTO</w:t>
+              <w:t>READY</w:t>
             </w:r>
           </w:p>
         </w:tc>
@@ -2762,7 +2758,7 @@
                 <w:szCs w:val="18"/>
                 <w:rFonts w:ascii="Calibri" w:cs="Calibri" w:eastAsia="Calibri" w:hAnsi="Calibri"/>
               </w:rPr>
-              <w:t xml:space="preserve">Búsqueda con retardo, sólida</w:t>
+              <w:t>Debounced search, solid</w:t>
             </w:r>
           </w:p>
         </w:tc>
@@ -2782,7 +2778,7 @@
           <w:szCs w:val="25"/>
           <w:rFonts w:ascii="Georgia" w:cs="Georgia" w:eastAsia="Georgia" w:hAnsi="Georgia"/>
         </w:rPr>
-        <w:t xml:space="preserve">3.2 Compra, cuenta y seguimiento</w:t>
+        <w:t>3.2 Purchase, account and tracking</w:t>
       </w:r>
     </w:p>
     <w:tbl>
@@ -2832,7 +2828,7 @@
                 <w:szCs w:val="18"/>
                 <w:rFonts w:ascii="Calibri" w:cs="Calibri" w:eastAsia="Calibri" w:hAnsi="Calibri"/>
               </w:rPr>
-              <w:t xml:space="preserve">Página</w:t>
+              <w:t>Page</w:t>
             </w:r>
           </w:p>
         </w:tc>
@@ -2861,7 +2857,7 @@
                 <w:szCs w:val="18"/>
                 <w:rFonts w:ascii="Calibri" w:cs="Calibri" w:eastAsia="Calibri" w:hAnsi="Calibri"/>
               </w:rPr>
-              <w:t xml:space="preserve">Ruta</w:t>
+              <w:t>Route</w:t>
             </w:r>
           </w:p>
         </w:tc>
@@ -2890,7 +2886,7 @@
                 <w:szCs w:val="18"/>
                 <w:rFonts w:ascii="Calibri" w:cs="Calibri" w:eastAsia="Calibri" w:hAnsi="Calibri"/>
               </w:rPr>
-              <w:t xml:space="preserve">Estado</w:t>
+              <w:t>Status</w:t>
             </w:r>
           </w:p>
         </w:tc>
@@ -2919,7 +2915,7 @@
                 <w:szCs w:val="18"/>
                 <w:rFonts w:ascii="Calibri" w:cs="Calibri" w:eastAsia="Calibri" w:hAnsi="Calibri"/>
               </w:rPr>
-              <w:t xml:space="preserve">Notas</w:t>
+              <w:t>Notes</w:t>
             </w:r>
           </w:p>
         </w:tc>
@@ -2950,7 +2946,7 @@
                 <w:szCs w:val="18"/>
                 <w:rFonts w:ascii="Calibri" w:cs="Calibri" w:eastAsia="Calibri" w:hAnsi="Calibri"/>
               </w:rPr>
-              <w:t xml:space="preserve">Carrito lateral</w:t>
+              <w:t>Side cart</w:t>
             </w:r>
           </w:p>
         </w:tc>
@@ -2979,7 +2975,7 @@
                 <w:szCs w:val="18"/>
                 <w:rFonts w:ascii="Calibri" w:cs="Calibri" w:eastAsia="Calibri" w:hAnsi="Calibri"/>
               </w:rPr>
-              <w:t xml:space="preserve">(componente)</w:t>
+              <w:t>(component)</w:t>
             </w:r>
           </w:p>
         </w:tc>
@@ -3008,7 +3004,7 @@
                 <w:szCs w:val="18"/>
                 <w:rFonts w:ascii="Calibri" w:cs="Calibri" w:eastAsia="Calibri" w:hAnsi="Calibri"/>
               </w:rPr>
-              <w:t xml:space="preserve">LISTO</w:t>
+              <w:t>READY</w:t>
             </w:r>
           </w:p>
         </w:tc>
@@ -3037,7 +3033,7 @@
                 <w:szCs w:val="18"/>
                 <w:rFonts w:ascii="Calibri" w:cs="Calibri" w:eastAsia="Calibri" w:hAnsi="Calibri"/>
               </w:rPr>
-              <w:t xml:space="preserve">Cantidades, WhatsApp, ir a checkout</w:t>
+              <w:t>Quantities, WhatsApp, go to checkout</w:t>
             </w:r>
           </w:p>
         </w:tc>
@@ -3068,7 +3064,7 @@
                 <w:szCs w:val="18"/>
                 <w:rFonts w:ascii="Calibri" w:cs="Calibri" w:eastAsia="Calibri" w:hAnsi="Calibri"/>
               </w:rPr>
-              <w:t xml:space="preserve">Checkout (3 pasos)</w:t>
+              <w:t>Checkout (3 steps)</w:t>
             </w:r>
           </w:p>
         </w:tc>
@@ -3097,7 +3093,7 @@
                 <w:szCs w:val="18"/>
                 <w:rFonts w:ascii="Calibri" w:cs="Calibri" w:eastAsia="Calibri" w:hAnsi="Calibri"/>
               </w:rPr>
-              <w:t xml:space="preserve">/checkout</w:t>
+              <w:t>/checkout</w:t>
             </w:r>
           </w:p>
         </w:tc>
@@ -3126,7 +3122,7 @@
                 <w:szCs w:val="18"/>
                 <w:rFonts w:ascii="Calibri" w:cs="Calibri" w:eastAsia="Calibri" w:hAnsi="Calibri"/>
               </w:rPr>
-              <w:t xml:space="preserve">PARCIAL</w:t>
+              <w:t>PARTIAL</w:t>
             </w:r>
           </w:p>
         </w:tc>
@@ -3155,7 +3151,7 @@
                 <w:szCs w:val="18"/>
                 <w:rFonts w:ascii="Calibri" w:cs="Calibri" w:eastAsia="Calibri" w:hAnsi="Calibri"/>
               </w:rPr>
-              <w:t xml:space="preserve">Completo; depende del backend + datos de zonas</w:t>
+              <w:t>Complete; depends on the backend + zone data</w:t>
             </w:r>
           </w:p>
         </w:tc>
@@ -3186,7 +3182,7 @@
                 <w:szCs w:val="18"/>
                 <w:rFonts w:ascii="Calibri" w:cs="Calibri" w:eastAsia="Calibri" w:hAnsi="Calibri"/>
               </w:rPr>
-              <w:t xml:space="preserve">Pago Sentoo (callback)</w:t>
+              <w:t>Sentoo payment (callback)</w:t>
             </w:r>
           </w:p>
         </w:tc>
@@ -3215,7 +3211,7 @@
                 <w:szCs w:val="18"/>
                 <w:rFonts w:ascii="Calibri" w:cs="Calibri" w:eastAsia="Calibri" w:hAnsi="Calibri"/>
               </w:rPr>
-              <w:t xml:space="preserve">/payment/callback</w:t>
+              <w:t>/payment/callback</w:t>
             </w:r>
           </w:p>
         </w:tc>
@@ -3244,7 +3240,7 @@
                 <w:szCs w:val="18"/>
                 <w:rFonts w:ascii="Calibri" w:cs="Calibri" w:eastAsia="Calibri" w:hAnsi="Calibri"/>
               </w:rPr>
-              <w:t xml:space="preserve">LISTO</w:t>
+              <w:t>READY</w:t>
             </w:r>
           </w:p>
         </w:tc>
@@ -3273,7 +3269,7 @@
                 <w:szCs w:val="18"/>
                 <w:rFonts w:ascii="Calibri" w:cs="Calibri" w:eastAsia="Calibri" w:hAnsi="Calibri"/>
               </w:rPr>
-              <w:t xml:space="preserve">Consulta estado en vivo + tiempo real</w:t>
+              <w:t>Live status query + real time</w:t>
             </w:r>
           </w:p>
         </w:tc>
@@ -3304,7 +3300,7 @@
                 <w:szCs w:val="18"/>
                 <w:rFonts w:ascii="Calibri" w:cs="Calibri" w:eastAsia="Calibri" w:hAnsi="Calibri"/>
               </w:rPr>
-              <w:t xml:space="preserve">Seguir pedido</w:t>
+              <w:t>Track order</w:t>
             </w:r>
           </w:p>
         </w:tc>
@@ -3333,7 +3329,7 @@
                 <w:szCs w:val="18"/>
                 <w:rFonts w:ascii="Calibri" w:cs="Calibri" w:eastAsia="Calibri" w:hAnsi="Calibri"/>
               </w:rPr>
-              <w:t xml:space="preserve">/track-order</w:t>
+              <w:t>/track-order</w:t>
             </w:r>
           </w:p>
         </w:tc>
@@ -3362,7 +3358,7 @@
                 <w:szCs w:val="18"/>
                 <w:rFonts w:ascii="Calibri" w:cs="Calibri" w:eastAsia="Calibri" w:hAnsi="Calibri"/>
               </w:rPr>
-              <w:t xml:space="preserve">LISTO</w:t>
+              <w:t>READY</w:t>
             </w:r>
           </w:p>
         </w:tc>
@@ -3391,7 +3387,7 @@
                 <w:szCs w:val="18"/>
                 <w:rFonts w:ascii="Calibri" w:cs="Calibri" w:eastAsia="Calibri" w:hAnsi="Calibri"/>
               </w:rPr>
-              <w:t xml:space="preserve">Buscador por número de orden</w:t>
+              <w:t>Lookup by order number</w:t>
             </w:r>
           </w:p>
         </w:tc>
@@ -3422,7 +3418,7 @@
                 <w:szCs w:val="18"/>
                 <w:rFonts w:ascii="Calibri" w:cs="Calibri" w:eastAsia="Calibri" w:hAnsi="Calibri"/>
               </w:rPr>
-              <w:t xml:space="preserve">Login / Registro</w:t>
+              <w:t>Login / Register</w:t>
             </w:r>
           </w:p>
         </w:tc>
@@ -3451,7 +3447,7 @@
                 <w:szCs w:val="18"/>
                 <w:rFonts w:ascii="Calibri" w:cs="Calibri" w:eastAsia="Calibri" w:hAnsi="Calibri"/>
               </w:rPr>
-              <w:t xml:space="preserve">/login /register</w:t>
+              <w:t>/login /register</w:t>
             </w:r>
           </w:p>
         </w:tc>
@@ -3480,7 +3476,7 @@
                 <w:szCs w:val="18"/>
                 <w:rFonts w:ascii="Calibri" w:cs="Calibri" w:eastAsia="Calibri" w:hAnsi="Calibri"/>
               </w:rPr>
-              <w:t xml:space="preserve">LISTO</w:t>
+              <w:t>READY</w:t>
             </w:r>
           </w:p>
         </w:tc>
@@ -3509,7 +3505,7 @@
                 <w:szCs w:val="18"/>
                 <w:rFonts w:ascii="Calibri" w:cs="Calibri" w:eastAsia="Calibri" w:hAnsi="Calibri"/>
               </w:rPr>
-              <w:t xml:space="preserve">Depende del backend</w:t>
+              <w:t>Depends on the backend</w:t>
             </w:r>
           </w:p>
         </w:tc>
@@ -3540,7 +3536,7 @@
                 <w:szCs w:val="18"/>
                 <w:rFonts w:ascii="Calibri" w:cs="Calibri" w:eastAsia="Calibri" w:hAnsi="Calibri"/>
               </w:rPr>
-              <w:t xml:space="preserve">Recuperar contraseña</w:t>
+              <w:t>Password recovery</w:t>
             </w:r>
           </w:p>
         </w:tc>
@@ -3569,7 +3565,7 @@
                 <w:szCs w:val="18"/>
                 <w:rFonts w:ascii="Calibri" w:cs="Calibri" w:eastAsia="Calibri" w:hAnsi="Calibri"/>
               </w:rPr>
-              <w:t xml:space="preserve">/forgot-password</w:t>
+              <w:t>/forgot-password</w:t>
             </w:r>
           </w:p>
         </w:tc>
@@ -3598,7 +3594,7 @@
                 <w:szCs w:val="18"/>
                 <w:rFonts w:ascii="Calibri" w:cs="Calibri" w:eastAsia="Calibri" w:hAnsi="Calibri"/>
               </w:rPr>
-              <w:t xml:space="preserve">PARCIAL</w:t>
+              <w:t>PARTIAL</w:t>
             </w:r>
           </w:p>
         </w:tc>
@@ -3627,7 +3623,7 @@
                 <w:szCs w:val="18"/>
                 <w:rFonts w:ascii="Calibri" w:cs="Calibri" w:eastAsia="Calibri" w:hAnsi="Calibri"/>
               </w:rPr>
-              <w:t xml:space="preserve">Envía enlace pero falta la página para cambiarla</w:t>
+              <w:t>Sends the link but the page to change it is missing</w:t>
             </w:r>
           </w:p>
         </w:tc>
@@ -3658,7 +3654,7 @@
                 <w:szCs w:val="18"/>
                 <w:rFonts w:ascii="Calibri" w:cs="Calibri" w:eastAsia="Calibri" w:hAnsi="Calibri"/>
               </w:rPr>
-              <w:t xml:space="preserve">Perfil</w:t>
+              <w:t>Profile</w:t>
             </w:r>
           </w:p>
         </w:tc>
@@ -3687,7 +3683,7 @@
                 <w:szCs w:val="18"/>
                 <w:rFonts w:ascii="Calibri" w:cs="Calibri" w:eastAsia="Calibri" w:hAnsi="Calibri"/>
               </w:rPr>
-              <w:t xml:space="preserve">/profile</w:t>
+              <w:t>/profile</w:t>
             </w:r>
           </w:p>
         </w:tc>
@@ -3716,7 +3712,7 @@
                 <w:szCs w:val="18"/>
                 <w:rFonts w:ascii="Calibri" w:cs="Calibri" w:eastAsia="Calibri" w:hAnsi="Calibri"/>
               </w:rPr>
-              <w:t xml:space="preserve">LISTO</w:t>
+              <w:t>READY</w:t>
             </w:r>
           </w:p>
         </w:tc>
@@ -3745,7 +3741,7 @@
                 <w:szCs w:val="18"/>
                 <w:rFonts w:ascii="Calibri" w:cs="Calibri" w:eastAsia="Calibri" w:hAnsi="Calibri"/>
               </w:rPr>
-              <w:t xml:space="preserve">Protegido; datos, pedidos, contraseña</w:t>
+              <w:t>Protected; details, orders, password</w:t>
             </w:r>
           </w:p>
         </w:tc>
@@ -3776,7 +3772,7 @@
                 <w:szCs w:val="18"/>
                 <w:rFonts w:ascii="Calibri" w:cs="Calibri" w:eastAsia="Calibri" w:hAnsi="Calibri"/>
               </w:rPr>
-              <w:t xml:space="preserve">Lista de deseos</w:t>
+              <w:t>Wishlist</w:t>
             </w:r>
           </w:p>
         </w:tc>
@@ -3805,7 +3801,7 @@
                 <w:szCs w:val="18"/>
                 <w:rFonts w:ascii="Calibri" w:cs="Calibri" w:eastAsia="Calibri" w:hAnsi="Calibri"/>
               </w:rPr>
-              <w:t xml:space="preserve">/wishlist</w:t>
+              <w:t>/wishlist</w:t>
             </w:r>
           </w:p>
         </w:tc>
@@ -3834,7 +3830,7 @@
                 <w:szCs w:val="18"/>
                 <w:rFonts w:ascii="Calibri" w:cs="Calibri" w:eastAsia="Calibri" w:hAnsi="Calibri"/>
               </w:rPr>
-              <w:t xml:space="preserve">LISTO</w:t>
+              <w:t>READY</w:t>
             </w:r>
           </w:p>
         </w:tc>
@@ -3863,7 +3859,7 @@
                 <w:szCs w:val="18"/>
                 <w:rFonts w:ascii="Calibri" w:cs="Calibri" w:eastAsia="Calibri" w:hAnsi="Calibri"/>
               </w:rPr>
-              <w:t xml:space="preserve">Guardado local en el navegador</w:t>
+              <w:t>Stored locally in the browser</w:t>
             </w:r>
           </w:p>
         </w:tc>
@@ -3894,7 +3890,7 @@
                 <w:szCs w:val="18"/>
                 <w:rFonts w:ascii="Calibri" w:cs="Calibri" w:eastAsia="Calibri" w:hAnsi="Calibri"/>
               </w:rPr>
-              <w:t xml:space="preserve">Admin</w:t>
+              <w:t>Admin</w:t>
             </w:r>
           </w:p>
         </w:tc>
@@ -3923,7 +3919,7 @@
                 <w:szCs w:val="18"/>
                 <w:rFonts w:ascii="Calibri" w:cs="Calibri" w:eastAsia="Calibri" w:hAnsi="Calibri"/>
               </w:rPr>
-              <w:t xml:space="preserve">/admin</w:t>
+              <w:t>/admin</w:t>
             </w:r>
           </w:p>
         </w:tc>
@@ -3952,7 +3948,7 @@
                 <w:szCs w:val="18"/>
                 <w:rFonts w:ascii="Calibri" w:cs="Calibri" w:eastAsia="Calibri" w:hAnsi="Calibri"/>
               </w:rPr>
-              <w:t xml:space="preserve">PARCIAL</w:t>
+              <w:t>PARTIAL</w:t>
             </w:r>
           </w:p>
         </w:tc>
@@ -3981,7 +3977,7 @@
                 <w:szCs w:val="18"/>
                 <w:rFonts w:ascii="Calibri" w:cs="Calibri" w:eastAsia="Calibri" w:hAnsi="Calibri"/>
               </w:rPr>
-              <w:t xml:space="preserve">Sin protección de ruta; botones "ver" son stubs</w:t>
+              <w:t>No route protection; "view" buttons are stubs</w:t>
             </w:r>
           </w:p>
         </w:tc>
@@ -4001,7 +3997,7 @@
           <w:szCs w:val="25"/>
           <w:rFonts w:ascii="Georgia" w:cs="Georgia" w:eastAsia="Georgia" w:hAnsi="Georgia"/>
         </w:rPr>
-        <w:t xml:space="preserve">3.3 Contenido, legal y contacto</w:t>
+        <w:t>3.3 Content, legal and contact</w:t>
       </w:r>
     </w:p>
     <w:tbl>
@@ -4051,7 +4047,7 @@
                 <w:szCs w:val="18"/>
                 <w:rFonts w:ascii="Calibri" w:cs="Calibri" w:eastAsia="Calibri" w:hAnsi="Calibri"/>
               </w:rPr>
-              <w:t xml:space="preserve">Página</w:t>
+              <w:t>Page</w:t>
             </w:r>
           </w:p>
         </w:tc>
@@ -4080,7 +4076,7 @@
                 <w:szCs w:val="18"/>
                 <w:rFonts w:ascii="Calibri" w:cs="Calibri" w:eastAsia="Calibri" w:hAnsi="Calibri"/>
               </w:rPr>
-              <w:t xml:space="preserve">Ruta</w:t>
+              <w:t>Route</w:t>
             </w:r>
           </w:p>
         </w:tc>
@@ -4109,7 +4105,7 @@
                 <w:szCs w:val="18"/>
                 <w:rFonts w:ascii="Calibri" w:cs="Calibri" w:eastAsia="Calibri" w:hAnsi="Calibri"/>
               </w:rPr>
-              <w:t xml:space="preserve">Estado</w:t>
+              <w:t>Status</w:t>
             </w:r>
           </w:p>
         </w:tc>
@@ -4138,7 +4134,7 @@
                 <w:szCs w:val="18"/>
                 <w:rFonts w:ascii="Calibri" w:cs="Calibri" w:eastAsia="Calibri" w:hAnsi="Calibri"/>
               </w:rPr>
-              <w:t xml:space="preserve">Notas</w:t>
+              <w:t>Notes</w:t>
             </w:r>
           </w:p>
         </w:tc>
@@ -4169,7 +4165,7 @@
                 <w:szCs w:val="18"/>
                 <w:rFonts w:ascii="Calibri" w:cs="Calibri" w:eastAsia="Calibri" w:hAnsi="Calibri"/>
               </w:rPr>
-              <w:t xml:space="preserve">Nosotros / FAQ / Términos / Privacidad</w:t>
+              <w:t>About us / FAQ / Terms / Privacy</w:t>
             </w:r>
           </w:p>
         </w:tc>
@@ -4198,7 +4194,7 @@
                 <w:szCs w:val="18"/>
                 <w:rFonts w:ascii="Calibri" w:cs="Calibri" w:eastAsia="Calibri" w:hAnsi="Calibri"/>
               </w:rPr>
-              <w:t xml:space="preserve">/about …</w:t>
+              <w:t>/about …</w:t>
             </w:r>
           </w:p>
         </w:tc>
@@ -4227,7 +4223,7 @@
                 <w:szCs w:val="18"/>
                 <w:rFonts w:ascii="Calibri" w:cs="Calibri" w:eastAsia="Calibri" w:hAnsi="Calibri"/>
               </w:rPr>
-              <w:t xml:space="preserve">LISTO</w:t>
+              <w:t>READY</w:t>
             </w:r>
           </w:p>
         </w:tc>
@@ -4256,7 +4252,7 @@
                 <w:szCs w:val="18"/>
                 <w:rFonts w:ascii="Calibri" w:cs="Calibri" w:eastAsia="Calibri" w:hAnsi="Calibri"/>
               </w:rPr>
-              <w:t xml:space="preserve">Contenido estático listo</w:t>
+              <w:t>Static content ready</w:t>
             </w:r>
           </w:p>
         </w:tc>
@@ -4287,7 +4283,7 @@
                 <w:szCs w:val="18"/>
                 <w:rFonts w:ascii="Calibri" w:cs="Calibri" w:eastAsia="Calibri" w:hAnsi="Calibri"/>
               </w:rPr>
-              <w:t xml:space="preserve">Envíos (con MAPA de zonas)</w:t>
+              <w:t>Shipping (with zone MAP)</w:t>
             </w:r>
           </w:p>
         </w:tc>
@@ -4316,7 +4312,7 @@
                 <w:szCs w:val="18"/>
                 <w:rFonts w:ascii="Calibri" w:cs="Calibri" w:eastAsia="Calibri" w:hAnsi="Calibri"/>
               </w:rPr>
-              <w:t xml:space="preserve">/shipping</w:t>
+              <w:t>/shipping</w:t>
             </w:r>
           </w:p>
         </w:tc>
@@ -4345,7 +4341,7 @@
                 <w:szCs w:val="18"/>
                 <w:rFonts w:ascii="Calibri" w:cs="Calibri" w:eastAsia="Calibri" w:hAnsi="Calibri"/>
               </w:rPr>
-              <w:t xml:space="preserve">PARCIAL</w:t>
+              <w:t>PARTIAL</w:t>
             </w:r>
           </w:p>
         </w:tc>
@@ -4374,7 +4370,7 @@
                 <w:szCs w:val="18"/>
                 <w:rFonts w:ascii="Calibri" w:cs="Calibri" w:eastAsia="Calibri" w:hAnsi="Calibri"/>
               </w:rPr>
-              <w:t xml:space="preserve">Mapa listo; barrios dependen del backend</w:t>
+              <w:t>Map ready; neighbourhoods depend on the backend</w:t>
             </w:r>
           </w:p>
         </w:tc>
@@ -4405,7 +4401,7 @@
                 <w:szCs w:val="18"/>
                 <w:rFonts w:ascii="Calibri" w:cs="Calibri" w:eastAsia="Calibri" w:hAnsi="Calibri"/>
               </w:rPr>
-              <w:t xml:space="preserve">Contacto</w:t>
+              <w:t>Contact</w:t>
             </w:r>
           </w:p>
         </w:tc>
@@ -4434,7 +4430,7 @@
                 <w:szCs w:val="18"/>
                 <w:rFonts w:ascii="Calibri" w:cs="Calibri" w:eastAsia="Calibri" w:hAnsi="Calibri"/>
               </w:rPr>
-              <w:t xml:space="preserve">/contact</w:t>
+              <w:t>/contact</w:t>
             </w:r>
           </w:p>
         </w:tc>
@@ -4463,7 +4459,7 @@
                 <w:szCs w:val="18"/>
                 <w:rFonts w:ascii="Calibri" w:cs="Calibri" w:eastAsia="Calibri" w:hAnsi="Calibri"/>
               </w:rPr>
-              <w:t xml:space="preserve">PARCIAL</w:t>
+              <w:t>PARTIAL</w:t>
             </w:r>
           </w:p>
         </w:tc>
@@ -4492,7 +4488,7 @@
                 <w:szCs w:val="18"/>
                 <w:rFonts w:ascii="Calibri" w:cs="Calibri" w:eastAsia="Calibri" w:hAnsi="Calibri"/>
               </w:rPr>
-              <w:t xml:space="preserve">El formulario aún no envía nada</w:t>
+              <w:t>The form does not send anything yet</w:t>
             </w:r>
           </w:p>
         </w:tc>
@@ -4523,7 +4519,7 @@
                 <w:szCs w:val="18"/>
                 <w:rFonts w:ascii="Calibri" w:cs="Calibri" w:eastAsia="Calibri" w:hAnsi="Calibri"/>
               </w:rPr>
-              <w:t xml:space="preserve">404 No encontrado</w:t>
+              <w:t>404 Not found</w:t>
             </w:r>
           </w:p>
         </w:tc>
@@ -4552,7 +4548,7 @@
                 <w:szCs w:val="18"/>
                 <w:rFonts w:ascii="Calibri" w:cs="Calibri" w:eastAsia="Calibri" w:hAnsi="Calibri"/>
               </w:rPr>
-              <w:t xml:space="preserve">*</w:t>
+              <w:t>*</w:t>
             </w:r>
           </w:p>
         </w:tc>
@@ -4581,7 +4577,7 @@
                 <w:szCs w:val="18"/>
                 <w:rFonts w:ascii="Calibri" w:cs="Calibri" w:eastAsia="Calibri" w:hAnsi="Calibri"/>
               </w:rPr>
-              <w:t xml:space="preserve">LISTO</w:t>
+              <w:t>READY</w:t>
             </w:r>
           </w:p>
         </w:tc>
@@ -4610,7 +4606,7 @@
                 <w:szCs w:val="18"/>
                 <w:rFonts w:ascii="Calibri" w:cs="Calibri" w:eastAsia="Calibri" w:hAnsi="Calibri"/>
               </w:rPr>
-              <w:t xml:space="preserve">Listo</w:t>
+              <w:t>Ready</w:t>
             </w:r>
           </w:p>
         </w:tc>
@@ -4638,7 +4634,7 @@
           <w:szCs w:val="30"/>
           <w:rFonts w:ascii="Georgia" w:cs="Georgia" w:eastAsia="Georgia" w:hAnsi="Georgia"/>
         </w:rPr>
-        <w:t xml:space="preserve">4. Backend — el motor (APIs)</w:t>
+        <w:t>4. Backend — the engine (APIs)</w:t>
       </w:r>
     </w:p>
     <w:p>
@@ -4657,7 +4653,7 @@
           <w:szCs w:val="21"/>
           <w:rFonts w:ascii="Calibri" w:cs="Calibri" w:eastAsia="Calibri" w:hAnsi="Calibri"/>
         </w:rPr>
-        <w:t xml:space="preserve">El backend está sustancialmente completo y a nivel producción: consultas seguras a la base de datos, contraseñas encriptadas (bcrypt), órdenes con transacciones y bloqueo de stock, y validación de datos. Estas son las áreas de la API:</w:t>
+        <w:t>The backend is substantially complete and production-grade: secure database queries, encrypted passwords (bcrypt), orders with transactions and stock locking, and data validation. These are the API areas:</w:t>
       </w:r>
     </w:p>
     <w:tbl>
@@ -4706,7 +4702,7 @@
                 <w:szCs w:val="18"/>
                 <w:rFonts w:ascii="Calibri" w:cs="Calibri" w:eastAsia="Calibri" w:hAnsi="Calibri"/>
               </w:rPr>
-              <w:t xml:space="preserve">Área (API)</w:t>
+              <w:t>Area (API)</w:t>
             </w:r>
           </w:p>
         </w:tc>
@@ -4735,7 +4731,7 @@
                 <w:szCs w:val="18"/>
                 <w:rFonts w:ascii="Calibri" w:cs="Calibri" w:eastAsia="Calibri" w:hAnsi="Calibri"/>
               </w:rPr>
-              <w:t xml:space="preserve">Qué hace</w:t>
+              <w:t>What it does</w:t>
             </w:r>
           </w:p>
         </w:tc>
@@ -4764,7 +4760,7 @@
                 <w:szCs w:val="18"/>
                 <w:rFonts w:ascii="Calibri" w:cs="Calibri" w:eastAsia="Calibri" w:hAnsi="Calibri"/>
               </w:rPr>
-              <w:t xml:space="preserve">Estado</w:t>
+              <w:t>Status</w:t>
             </w:r>
           </w:p>
         </w:tc>
@@ -4795,7 +4791,7 @@
                 <w:szCs w:val="18"/>
                 <w:rFonts w:ascii="Calibri" w:cs="Calibri" w:eastAsia="Calibri" w:hAnsi="Calibri"/>
               </w:rPr>
-              <w:t xml:space="preserve">Autenticación</w:t>
+              <w:t>Authentication</w:t>
             </w:r>
           </w:p>
         </w:tc>
@@ -4824,7 +4820,7 @@
                 <w:szCs w:val="18"/>
                 <w:rFonts w:ascii="Calibri" w:cs="Calibri" w:eastAsia="Calibri" w:hAnsi="Calibri"/>
               </w:rPr>
-              <w:t xml:space="preserve">Registro, login, verificación por email, refresh, recuperar contraseña</w:t>
+              <w:t>Registration, login, email verification, refresh, password recovery</w:t>
             </w:r>
           </w:p>
         </w:tc>
@@ -4853,7 +4849,7 @@
                 <w:szCs w:val="18"/>
                 <w:rFonts w:ascii="Calibri" w:cs="Calibri" w:eastAsia="Calibri" w:hAnsi="Calibri"/>
               </w:rPr>
-              <w:t xml:space="preserve">LISTO</w:t>
+              <w:t>READY</w:t>
             </w:r>
           </w:p>
         </w:tc>
@@ -4884,7 +4880,7 @@
                 <w:szCs w:val="18"/>
                 <w:rFonts w:ascii="Calibri" w:cs="Calibri" w:eastAsia="Calibri" w:hAnsi="Calibri"/>
               </w:rPr>
-              <w:t xml:space="preserve">Productos / Categorías</w:t>
+              <w:t>Products / Categories</w:t>
             </w:r>
           </w:p>
         </w:tc>
@@ -4913,7 +4909,7 @@
                 <w:szCs w:val="18"/>
                 <w:rFonts w:ascii="Calibri" w:cs="Calibri" w:eastAsia="Calibri" w:hAnsi="Calibri"/>
               </w:rPr>
-              <w:t xml:space="preserve">Listado, filtros, paginación, búsqueda, destacados</w:t>
+              <w:t>Listing, filters, pagination, search, featured items</w:t>
             </w:r>
           </w:p>
         </w:tc>
@@ -4942,7 +4938,7 @@
                 <w:szCs w:val="18"/>
                 <w:rFonts w:ascii="Calibri" w:cs="Calibri" w:eastAsia="Calibri" w:hAnsi="Calibri"/>
               </w:rPr>
-              <w:t xml:space="preserve">LISTO</w:t>
+              <w:t>READY</w:t>
             </w:r>
           </w:p>
         </w:tc>
@@ -4973,7 +4969,7 @@
                 <w:szCs w:val="18"/>
                 <w:rFonts w:ascii="Calibri" w:cs="Calibri" w:eastAsia="Calibri" w:hAnsi="Calibri"/>
               </w:rPr>
-              <w:t xml:space="preserve">Perfumes / Skincare</w:t>
+              <w:t>Perfumes / Skincare</w:t>
             </w:r>
           </w:p>
         </w:tc>
@@ -5002,7 +4998,7 @@
                 <w:szCs w:val="18"/>
                 <w:rFonts w:ascii="Calibri" w:cs="Calibri" w:eastAsia="Calibri" w:hAnsi="Calibri"/>
               </w:rPr>
-              <w:t xml:space="preserve">Quiz con algoritmo real de recomendación</w:t>
+              <w:t>Quiz with a real recommendation algorithm</w:t>
             </w:r>
           </w:p>
         </w:tc>
@@ -5031,7 +5027,7 @@
                 <w:szCs w:val="18"/>
                 <w:rFonts w:ascii="Calibri" w:cs="Calibri" w:eastAsia="Calibri" w:hAnsi="Calibri"/>
               </w:rPr>
-              <w:t xml:space="preserve">LISTO</w:t>
+              <w:t>READY</w:t>
             </w:r>
           </w:p>
         </w:tc>
@@ -5062,7 +5058,7 @@
                 <w:szCs w:val="18"/>
                 <w:rFonts w:ascii="Calibri" w:cs="Calibri" w:eastAsia="Calibri" w:hAnsi="Calibri"/>
               </w:rPr>
-              <w:t xml:space="preserve">Carrito</w:t>
+              <w:t>Cart</w:t>
             </w:r>
           </w:p>
         </w:tc>
@@ -5091,7 +5087,7 @@
                 <w:szCs w:val="18"/>
                 <w:rFonts w:ascii="Calibri" w:cs="Calibri" w:eastAsia="Calibri" w:hAnsi="Calibri"/>
               </w:rPr>
-              <w:t xml:space="preserve">Invitado (Redis) y usuario (BD), fusión al iniciar sesión</w:t>
+              <w:t>Guest (Redis) and user (DB), merged on login</w:t>
             </w:r>
           </w:p>
         </w:tc>
@@ -5120,7 +5116,7 @@
                 <w:szCs w:val="18"/>
                 <w:rFonts w:ascii="Calibri" w:cs="Calibri" w:eastAsia="Calibri" w:hAnsi="Calibri"/>
               </w:rPr>
-              <w:t xml:space="preserve">LISTO</w:t>
+              <w:t>READY</w:t>
             </w:r>
           </w:p>
         </w:tc>
@@ -5151,7 +5147,7 @@
                 <w:szCs w:val="18"/>
                 <w:rFonts w:ascii="Calibri" w:cs="Calibri" w:eastAsia="Calibri" w:hAnsi="Calibri"/>
               </w:rPr>
-              <w:t xml:space="preserve">Órdenes</w:t>
+              <w:t>Orders</w:t>
             </w:r>
           </w:p>
         </w:tc>
@@ -5180,7 +5176,7 @@
                 <w:szCs w:val="18"/>
                 <w:rFonts w:ascii="Calibri" w:cs="Calibri" w:eastAsia="Calibri" w:hAnsi="Calibri"/>
               </w:rPr>
-              <w:t xml:space="preserve">Checkout transaccional, descuento de stock, cupones, zona</w:t>
+              <w:t>Transactional checkout, stock deduction, coupons, zone</w:t>
             </w:r>
           </w:p>
         </w:tc>
@@ -5209,7 +5205,7 @@
                 <w:szCs w:val="18"/>
                 <w:rFonts w:ascii="Calibri" w:cs="Calibri" w:eastAsia="Calibri" w:hAnsi="Calibri"/>
               </w:rPr>
-              <w:t xml:space="preserve">LISTO</w:t>
+              <w:t>READY</w:t>
             </w:r>
           </w:p>
         </w:tc>
@@ -5240,7 +5236,7 @@
                 <w:szCs w:val="18"/>
                 <w:rFonts w:ascii="Calibri" w:cs="Calibri" w:eastAsia="Calibri" w:hAnsi="Calibri"/>
               </w:rPr>
-              <w:t xml:space="preserve">Pagos</w:t>
+              <w:t>Payments</w:t>
             </w:r>
           </w:p>
         </w:tc>
@@ -5269,7 +5265,7 @@
                 <w:szCs w:val="18"/>
                 <w:rFonts w:ascii="Calibri" w:cs="Calibri" w:eastAsia="Calibri" w:hAnsi="Calibri"/>
               </w:rPr>
-              <w:t xml:space="preserve">Sentoo real, contra-entrega, transferencia bancaria</w:t>
+              <w:t>Real Sentoo, cash on delivery, bank transfer</w:t>
             </w:r>
           </w:p>
         </w:tc>
@@ -5298,7 +5294,7 @@
                 <w:szCs w:val="18"/>
                 <w:rFonts w:ascii="Calibri" w:cs="Calibri" w:eastAsia="Calibri" w:hAnsi="Calibri"/>
               </w:rPr>
-              <w:t xml:space="preserve">cuenta banco pendiente</w:t>
+              <w:t>bank account pending</w:t>
             </w:r>
           </w:p>
         </w:tc>
@@ -5329,7 +5325,7 @@
                 <w:szCs w:val="18"/>
                 <w:rFonts w:ascii="Calibri" w:cs="Calibri" w:eastAsia="Calibri" w:hAnsi="Calibri"/>
               </w:rPr>
-              <w:t xml:space="preserve">Admin</w:t>
+              <w:t>Admin</w:t>
             </w:r>
           </w:p>
         </w:tc>
@@ -5358,7 +5354,7 @@
                 <w:szCs w:val="18"/>
                 <w:rFonts w:ascii="Calibri" w:cs="Calibri" w:eastAsia="Calibri" w:hAnsi="Calibri"/>
               </w:rPr>
-              <w:t xml:space="preserve">Gestión de usuarios y órdenes, estadísticas</w:t>
+              <w:t>User and order management, statistics</w:t>
             </w:r>
           </w:p>
         </w:tc>
@@ -5387,7 +5383,7 @@
                 <w:szCs w:val="18"/>
                 <w:rFonts w:ascii="Calibri" w:cs="Calibri" w:eastAsia="Calibri" w:hAnsi="Calibri"/>
               </w:rPr>
-              <w:t xml:space="preserve">LISTO</w:t>
+              <w:t>READY</w:t>
             </w:r>
           </w:p>
         </w:tc>
@@ -5418,7 +5414,7 @@
                 <w:szCs w:val="18"/>
                 <w:rFonts w:ascii="Calibri" w:cs="Calibri" w:eastAsia="Calibri" w:hAnsi="Calibri"/>
               </w:rPr>
-              <w:t xml:space="preserve">Reseñas</w:t>
+              <w:t>Reviews</w:t>
             </w:r>
           </w:p>
         </w:tc>
@@ -5447,7 +5443,7 @@
                 <w:szCs w:val="18"/>
                 <w:rFonts w:ascii="Calibri" w:cs="Calibri" w:eastAsia="Calibri" w:hAnsi="Calibri"/>
               </w:rPr>
-              <w:t xml:space="preserve">Crear/leer/borrar</w:t>
+              <w:t>Create/read/delete</w:t>
             </w:r>
           </w:p>
         </w:tc>
@@ -5476,7 +5472,7 @@
                 <w:szCs w:val="18"/>
                 <w:rFonts w:ascii="Calibri" w:cs="Calibri" w:eastAsia="Calibri" w:hAnsi="Calibri"/>
               </w:rPr>
-              <w:t xml:space="preserve">bug de tipo de dato</w:t>
+              <w:t>data type bug</w:t>
             </w:r>
           </w:p>
         </w:tc>
@@ -5507,7 +5503,7 @@
                 <w:szCs w:val="18"/>
                 <w:rFonts w:ascii="Calibri" w:cs="Calibri" w:eastAsia="Calibri" w:hAnsi="Calibri"/>
               </w:rPr>
-              <w:t xml:space="preserve">Cupones</w:t>
+              <w:t>Coupons</w:t>
             </w:r>
           </w:p>
         </w:tc>
@@ -5536,7 +5532,7 @@
                 <w:szCs w:val="18"/>
                 <w:rFonts w:ascii="Calibri" w:cs="Calibri" w:eastAsia="Calibri" w:hAnsi="Calibri"/>
               </w:rPr>
-              <w:t xml:space="preserve">Validar y aplicar (seguro ante concurrencia)</w:t>
+              <w:t>Validate and apply (concurrency-safe)</w:t>
             </w:r>
           </w:p>
         </w:tc>
@@ -5565,7 +5561,7 @@
                 <w:szCs w:val="18"/>
                 <w:rFonts w:ascii="Calibri" w:cs="Calibri" w:eastAsia="Calibri" w:hAnsi="Calibri"/>
               </w:rPr>
-              <w:t xml:space="preserve">LISTO</w:t>
+              <w:t>READY</w:t>
             </w:r>
           </w:p>
         </w:tc>
@@ -5596,7 +5592,7 @@
                 <w:szCs w:val="18"/>
                 <w:rFonts w:ascii="Calibri" w:cs="Calibri" w:eastAsia="Calibri" w:hAnsi="Calibri"/>
               </w:rPr>
-              <w:t xml:space="preserve">Newsletter</w:t>
+              <w:t>Newsletter</w:t>
             </w:r>
           </w:p>
         </w:tc>
@@ -5625,7 +5621,7 @@
                 <w:szCs w:val="18"/>
                 <w:rFonts w:ascii="Calibri" w:cs="Calibri" w:eastAsia="Calibri" w:hAnsi="Calibri"/>
               </w:rPr>
-              <w:t xml:space="preserve">Suscripción</w:t>
+              <w:t>Subscription</w:t>
             </w:r>
           </w:p>
         </w:tc>
@@ -5654,7 +5650,7 @@
                 <w:szCs w:val="18"/>
                 <w:rFonts w:ascii="Calibri" w:cs="Calibri" w:eastAsia="Calibri" w:hAnsi="Calibri"/>
               </w:rPr>
-              <w:t xml:space="preserve">sin confirmación ni baja</w:t>
+              <w:t>no confirmation or unsubscribe</w:t>
             </w:r>
           </w:p>
         </w:tc>
@@ -5685,7 +5681,7 @@
                 <w:szCs w:val="18"/>
                 <w:rFonts w:ascii="Calibri" w:cs="Calibri" w:eastAsia="Calibri" w:hAnsi="Calibri"/>
               </w:rPr>
-              <w:t xml:space="preserve">WhatsApp</w:t>
+              <w:t>WhatsApp</w:t>
             </w:r>
           </w:p>
         </w:tc>
@@ -5714,7 +5710,7 @@
                 <w:szCs w:val="18"/>
                 <w:rFonts w:ascii="Calibri" w:cs="Calibri" w:eastAsia="Calibri" w:hAnsi="Calibri"/>
               </w:rPr>
-              <w:t xml:space="preserve">Chatbot en papiamentu, menús, estado de pedido</w:t>
+              <w:t>Chatbot in Papiamentu, menus, order status</w:t>
             </w:r>
           </w:p>
         </w:tc>
@@ -5743,7 +5739,7 @@
                 <w:szCs w:val="18"/>
                 <w:rFonts w:ascii="Calibri" w:cs="Calibri" w:eastAsia="Calibri" w:hAnsi="Calibri"/>
               </w:rPr>
-              <w:t xml:space="preserve">LISTO</w:t>
+              <w:t>READY</w:t>
             </w:r>
           </w:p>
         </w:tc>
@@ -5774,7 +5770,7 @@
                 <w:szCs w:val="18"/>
                 <w:rFonts w:ascii="Calibri" w:cs="Calibri" w:eastAsia="Calibri" w:hAnsi="Calibri"/>
               </w:rPr>
-              <w:t xml:space="preserve">Delivery</w:t>
+              <w:t>Delivery</w:t>
             </w:r>
           </w:p>
         </w:tc>
@@ -5803,7 +5799,7 @@
                 <w:szCs w:val="18"/>
                 <w:rFonts w:ascii="Calibri" w:cs="Calibri" w:eastAsia="Calibri" w:hAnsi="Calibri"/>
               </w:rPr>
-              <w:t xml:space="preserve">Zonas y cálculo de tarifa</w:t>
+              <w:t>Zones and fee calculation</w:t>
             </w:r>
           </w:p>
         </w:tc>
@@ -5832,7 +5828,7 @@
                 <w:szCs w:val="18"/>
                 <w:rFonts w:ascii="Calibri" w:cs="Calibri" w:eastAsia="Calibri" w:hAnsi="Calibri"/>
               </w:rPr>
-              <w:t xml:space="preserve">sin panel admin de zonas</w:t>
+              <w:t>no admin panel for zones</w:t>
             </w:r>
           </w:p>
         </w:tc>
@@ -5860,7 +5856,7 @@
           <w:szCs w:val="30"/>
           <w:rFonts w:ascii="Georgia" w:cs="Georgia" w:eastAsia="Georgia" w:hAnsi="Georgia"/>
         </w:rPr>
-        <w:t xml:space="preserve">5. Integraciones externas</w:t>
+        <w:t>5. External integrations</w:t>
       </w:r>
     </w:p>
     <w:p>
@@ -5879,7 +5875,7 @@
           <w:szCs w:val="21"/>
           <w:rFonts w:ascii="Calibri" w:cs="Calibri" w:eastAsia="Calibri" w:hAnsi="Calibri"/>
         </w:rPr>
-        <w:t xml:space="preserve">Las conexiones con servicios de terceros ya están programadas. La mayoría solo necesitan que pongas las llaves/credenciales de tu cuenta para activarse.</w:t>
+        <w:t>The connections with third-party services are already coded. Most of them only need you to enter your account keys/credentials to be activated.</w:t>
       </w:r>
     </w:p>
     <w:tbl>
@@ -5928,7 +5924,7 @@
                 <w:szCs w:val="18"/>
                 <w:rFonts w:ascii="Calibri" w:cs="Calibri" w:eastAsia="Calibri" w:hAnsi="Calibri"/>
               </w:rPr>
-              <w:t xml:space="preserve">Servicio</w:t>
+              <w:t>Service</w:t>
             </w:r>
           </w:p>
         </w:tc>
@@ -5957,7 +5953,7 @@
                 <w:szCs w:val="18"/>
                 <w:rFonts w:ascii="Calibri" w:cs="Calibri" w:eastAsia="Calibri" w:hAnsi="Calibri"/>
               </w:rPr>
-              <w:t xml:space="preserve">Estado del código</w:t>
+              <w:t>Code status</w:t>
             </w:r>
           </w:p>
         </w:tc>
@@ -5986,7 +5982,7 @@
                 <w:szCs w:val="18"/>
                 <w:rFonts w:ascii="Calibri" w:cs="Calibri" w:eastAsia="Calibri" w:hAnsi="Calibri"/>
               </w:rPr>
-              <w:t xml:space="preserve">Qué necesitas para activarlo</w:t>
+              <w:t>What you need to activate it</w:t>
             </w:r>
           </w:p>
         </w:tc>
@@ -6017,7 +6013,7 @@
                 <w:szCs w:val="18"/>
                 <w:rFonts w:ascii="Calibri" w:cs="Calibri" w:eastAsia="Calibri" w:hAnsi="Calibri"/>
               </w:rPr>
-              <w:t xml:space="preserve">Sentoo (pagos Curaçao)</w:t>
+              <w:t>Sentoo (Curaçao payments)</w:t>
             </w:r>
           </w:p>
         </w:tc>
@@ -6046,7 +6042,7 @@
                 <w:szCs w:val="18"/>
                 <w:rFonts w:ascii="Calibri" w:cs="Calibri" w:eastAsia="Calibri" w:hAnsi="Calibri"/>
               </w:rPr>
-              <w:t xml:space="preserve">LISTO</w:t>
+              <w:t>READY</w:t>
             </w:r>
           </w:p>
         </w:tc>
@@ -6075,7 +6071,7 @@
                 <w:szCs w:val="18"/>
                 <w:rFonts w:ascii="Calibri" w:cs="Calibri" w:eastAsia="Calibri" w:hAnsi="Calibri"/>
               </w:rPr>
-              <w:t xml:space="preserve">Poner SENTOO_API_KEY + MERCHANT_ID de tu cuenta</w:t>
+              <w:t>Enter SENTOO_API_KEY + MERCHANT_ID from your account</w:t>
             </w:r>
           </w:p>
         </w:tc>
@@ -6106,7 +6102,7 @@
                 <w:szCs w:val="18"/>
                 <w:rFonts w:ascii="Calibri" w:cs="Calibri" w:eastAsia="Calibri" w:hAnsi="Calibri"/>
               </w:rPr>
-              <w:t xml:space="preserve">WhatsApp Business</w:t>
+              <w:t>WhatsApp Business</w:t>
             </w:r>
           </w:p>
         </w:tc>
@@ -6135,7 +6131,7 @@
                 <w:szCs w:val="18"/>
                 <w:rFonts w:ascii="Calibri" w:cs="Calibri" w:eastAsia="Calibri" w:hAnsi="Calibri"/>
               </w:rPr>
-              <w:t xml:space="preserve">LISTO</w:t>
+              <w:t>READY</w:t>
             </w:r>
           </w:p>
         </w:tc>
@@ -6164,7 +6160,7 @@
                 <w:szCs w:val="18"/>
                 <w:rFonts w:ascii="Calibri" w:cs="Calibri" w:eastAsia="Calibri" w:hAnsi="Calibri"/>
               </w:rPr>
-              <w:t xml:space="preserve">Token de Meta + aprobar plantillas de mensaje en Meta</w:t>
+              <w:t>Meta token + approve message templates in Meta</w:t>
             </w:r>
           </w:p>
         </w:tc>
@@ -6195,7 +6191,7 @@
                 <w:szCs w:val="18"/>
                 <w:rFonts w:ascii="Calibri" w:cs="Calibri" w:eastAsia="Calibri" w:hAnsi="Calibri"/>
               </w:rPr>
-              <w:t xml:space="preserve">Email (SMTP)</w:t>
+              <w:t>Email (SMTP)</w:t>
             </w:r>
           </w:p>
         </w:tc>
@@ -6224,7 +6220,7 @@
                 <w:szCs w:val="18"/>
                 <w:rFonts w:ascii="Calibri" w:cs="Calibri" w:eastAsia="Calibri" w:hAnsi="Calibri"/>
               </w:rPr>
-              <w:t xml:space="preserve">LISTO</w:t>
+              <w:t>READY</w:t>
             </w:r>
           </w:p>
         </w:tc>
@@ -6253,7 +6249,7 @@
                 <w:szCs w:val="18"/>
                 <w:rFonts w:ascii="Calibri" w:cs="Calibri" w:eastAsia="Calibri" w:hAnsi="Calibri"/>
               </w:rPr>
-              <w:t xml:space="preserve">Datos de tu correo saliente (si no, no manda emails)</w:t>
+              <w:t>Your outgoing mail details (otherwise it does not send emails)</w:t>
             </w:r>
           </w:p>
         </w:tc>
@@ -6284,7 +6280,7 @@
                 <w:szCs w:val="18"/>
                 <w:rFonts w:ascii="Calibri" w:cs="Calibri" w:eastAsia="Calibri" w:hAnsi="Calibri"/>
               </w:rPr>
-              <w:t xml:space="preserve">Contra-entrega (COD)</w:t>
+              <w:t>Cash on delivery (COD)</w:t>
             </w:r>
           </w:p>
         </w:tc>
@@ -6313,7 +6309,7 @@
                 <w:szCs w:val="18"/>
                 <w:rFonts w:ascii="Calibri" w:cs="Calibri" w:eastAsia="Calibri" w:hAnsi="Calibri"/>
               </w:rPr>
-              <w:t xml:space="preserve">LISTO</w:t>
+              <w:t>READY</w:t>
             </w:r>
           </w:p>
         </w:tc>
@@ -6342,7 +6338,7 @@
                 <w:szCs w:val="18"/>
                 <w:rFonts w:ascii="Calibri" w:cs="Calibri" w:eastAsia="Calibri" w:hAnsi="Calibri"/>
               </w:rPr>
-              <w:t xml:space="preserve">Nada — funciona</w:t>
+              <w:t>Nothing — it works</w:t>
             </w:r>
           </w:p>
         </w:tc>
@@ -6373,7 +6369,7 @@
                 <w:szCs w:val="18"/>
                 <w:rFonts w:ascii="Calibri" w:cs="Calibri" w:eastAsia="Calibri" w:hAnsi="Calibri"/>
               </w:rPr>
-              <w:t xml:space="preserve">Transferencia bancaria</w:t>
+              <w:t>Bank transfer</w:t>
             </w:r>
           </w:p>
         </w:tc>
@@ -6402,7 +6398,7 @@
                 <w:szCs w:val="18"/>
                 <w:rFonts w:ascii="Calibri" w:cs="Calibri" w:eastAsia="Calibri" w:hAnsi="Calibri"/>
               </w:rPr>
-              <w:t xml:space="preserve">PARCIAL</w:t>
+              <w:t>PARTIAL</w:t>
             </w:r>
           </w:p>
         </w:tc>
@@ -6431,7 +6427,7 @@
                 <w:szCs w:val="18"/>
                 <w:rFonts w:ascii="Calibri" w:cs="Calibri" w:eastAsia="Calibri" w:hAnsi="Calibri"/>
               </w:rPr>
-              <w:t xml:space="preserve">Poner el número de cuenta REAL (hoy es un placeholder)</w:t>
+              <w:t>Enter the REAL account number (currently a placeholder)</w:t>
             </w:r>
           </w:p>
         </w:tc>
@@ -6462,7 +6458,7 @@
                 <w:szCs w:val="18"/>
                 <w:rFonts w:ascii="Calibri" w:cs="Calibri" w:eastAsia="Calibri" w:hAnsi="Calibri"/>
               </w:rPr>
-              <w:t xml:space="preserve">Mapa (OpenStreetMap)</w:t>
+              <w:t>Map (OpenStreetMap)</w:t>
             </w:r>
           </w:p>
         </w:tc>
@@ -6491,7 +6487,7 @@
                 <w:szCs w:val="18"/>
                 <w:rFonts w:ascii="Calibri" w:cs="Calibri" w:eastAsia="Calibri" w:hAnsi="Calibri"/>
               </w:rPr>
-              <w:t xml:space="preserve">LISTO</w:t>
+              <w:t>READY</w:t>
             </w:r>
           </w:p>
         </w:tc>
@@ -6520,7 +6516,7 @@
                 <w:szCs w:val="18"/>
                 <w:rFonts w:ascii="Calibri" w:cs="Calibri" w:eastAsia="Calibri" w:hAnsi="Calibri"/>
               </w:rPr>
-              <w:t xml:space="preserve">Nada — funciona. Revisar términos de uso comercial</w:t>
+              <w:t>Nothing — it works. Review the commercial terms of use</w:t>
             </w:r>
           </w:p>
         </w:tc>
@@ -6551,7 +6547,7 @@
                 <w:szCs w:val="18"/>
                 <w:rFonts w:ascii="Calibri" w:cs="Calibri" w:eastAsia="Calibri" w:hAnsi="Calibri"/>
               </w:rPr>
-              <w:t xml:space="preserve">Autocompletar dirección (Nominatim)</w:t>
+              <w:t>Address autocomplete (Nominatim)</w:t>
             </w:r>
           </w:p>
         </w:tc>
@@ -6580,7 +6576,7 @@
                 <w:szCs w:val="18"/>
                 <w:rFonts w:ascii="Calibri" w:cs="Calibri" w:eastAsia="Calibri" w:hAnsi="Calibri"/>
               </w:rPr>
-              <w:t xml:space="preserve">LISTO</w:t>
+              <w:t>READY</w:t>
             </w:r>
           </w:p>
         </w:tc>
@@ -6609,7 +6605,7 @@
                 <w:szCs w:val="18"/>
                 <w:rFonts w:ascii="Calibri" w:cs="Calibri" w:eastAsia="Calibri" w:hAnsi="Calibri"/>
               </w:rPr>
-              <w:t xml:space="preserve">Nada, pero es gratuito con límite de uso</w:t>
+              <w:t>Nothing, but it is free with a usage limit</w:t>
             </w:r>
           </w:p>
         </w:tc>
@@ -6640,7 +6636,7 @@
                 <w:szCs w:val="18"/>
                 <w:rFonts w:ascii="Calibri" w:cs="Calibri" w:eastAsia="Calibri" w:hAnsi="Calibri"/>
               </w:rPr>
-              <w:t xml:space="preserve">Tiempo real (Socket.IO)</w:t>
+              <w:t>Real time (Socket.IO)</w:t>
             </w:r>
           </w:p>
         </w:tc>
@@ -6669,7 +6665,7 @@
                 <w:szCs w:val="18"/>
                 <w:rFonts w:ascii="Calibri" w:cs="Calibri" w:eastAsia="Calibri" w:hAnsi="Calibri"/>
               </w:rPr>
-              <w:t xml:space="preserve">LISTO</w:t>
+              <w:t>READY</w:t>
             </w:r>
           </w:p>
         </w:tc>
@@ -6698,7 +6694,7 @@
                 <w:szCs w:val="18"/>
                 <w:rFonts w:ascii="Calibri" w:cs="Calibri" w:eastAsia="Calibri" w:hAnsi="Calibri"/>
               </w:rPr>
-              <w:t xml:space="preserve">Nada — actualiza estado de pago en vivo</w:t>
+              <w:t>Nothing — updates payment status live</w:t>
             </w:r>
           </w:p>
         </w:tc>
@@ -6752,7 +6748,7 @@
                 <w:szCs w:val="21"/>
                 <w:rFonts w:ascii="Calibri" w:cs="Calibri" w:eastAsia="Calibri" w:hAnsi="Calibri"/>
               </w:rPr>
-              <w:t xml:space="preserve">Sobre WhatsApp</w:t>
+              <w:t>About WhatsApp</w:t>
             </w:r>
           </w:p>
           <w:p>
@@ -6766,7 +6762,7 @@
                 <w:szCs w:val="20"/>
                 <w:rFonts w:ascii="Calibri" w:cs="Calibri" w:eastAsia="Calibri" w:hAnsi="Calibri"/>
               </w:rPr>
-              <w:t xml:space="preserve">El chatbot de WhatsApp está completo: responde en papiamentu, muestra menús, deja consultar el estado de un pedido y enlaza a categorías. Para que los mensajes automáticos de confirmación salgan, hay que crear y aprobar unas "plantillas" en Meta Business Manager (order_confirmation, order_shipped, etc.). Si no están aprobadas, el sistema usa un enlace wa.me como respaldo.</w:t>
+              <w:t>The WhatsApp chatbot is complete: it replies in Papiamentu, shows menus, lets customers check the status of an order and links to categories. For the automatic confirmation messages to go out, some "templates" must be created and approved in Meta Business Manager (order_confirmation, order_shipped, etc.). If they are not approved, the system uses a wa.me link as a fallback.</w:t>
             </w:r>
           </w:p>
         </w:tc>
@@ -6794,7 +6790,7 @@
           <w:szCs w:val="30"/>
           <w:rFonts w:ascii="Georgia" w:cs="Georgia" w:eastAsia="Georgia" w:hAnsi="Georgia"/>
         </w:rPr>
-        <w:t xml:space="preserve">6. Sistema de delivery — lo que YA funciona</w:t>
+        <w:t>6. Delivery system — what ALREADY works</w:t>
       </w:r>
     </w:p>
     <w:p>
@@ -6810,7 +6806,7 @@
           <w:szCs w:val="22"/>
           <w:rFonts w:ascii="Calibri" w:cs="Calibri" w:eastAsia="Calibri" w:hAnsi="Calibri"/>
         </w:rPr>
-        <w:t xml:space="preserve">Esta era tu mayor preocupación ("me falta el sistema completo de delivery"). La buena noticia: la base ya está construida. Lo que falta es la capa operativa (logística), que se detalla en el Documento 2.</w:t>
+        <w:t>This was your biggest concern ("I'm missing the complete delivery system"). The good news: the foundation is already built. What is missing is the operational (logistics) layer, which is detailed in Document 2.</w:t>
       </w:r>
     </w:p>
     <w:p>
@@ -6827,7 +6823,7 @@
           <w:szCs w:val="25"/>
           <w:rFonts w:ascii="Georgia" w:cs="Georgia" w:eastAsia="Georgia" w:hAnsi="Georgia"/>
         </w:rPr>
-        <w:t xml:space="preserve">6.1 Ya construido y funcionando</w:t>
+        <w:t>6.1 Already built and working</w:t>
       </w:r>
     </w:p>
     <w:p>
@@ -6850,7 +6846,7 @@
           <w:szCs w:val="21"/>
           <w:rFonts w:ascii="Calibri" w:cs="Calibri" w:eastAsia="Calibri" w:hAnsi="Calibri"/>
         </w:rPr>
-        <w:t xml:space="preserve">Mapa interactivo de Curaçao </w:t>
+        <w:t>Interactive map of Curaçao (Leaflet + OpenStreetMap) with the 3 zones drawn as coloured polygons.</w:t>
       </w:r>
       <w:r>
         <w:rPr>
@@ -6863,7 +6859,6 @@
           <w:szCs w:val="21"/>
           <w:rFonts w:ascii="Calibri" w:cs="Calibri" w:eastAsia="Calibri" w:hAnsi="Calibri"/>
         </w:rPr>
-        <w:t xml:space="preserve">(Leaflet + OpenStreetMap) con las 3 zonas dibujadas como polígonos de color.</w:t>
       </w:r>
     </w:p>
     <w:p>
@@ -6886,7 +6881,7 @@
           <w:szCs w:val="21"/>
           <w:rFonts w:ascii="Calibri" w:cs="Calibri" w:eastAsia="Calibri" w:hAnsi="Calibri"/>
         </w:rPr>
-        <w:t xml:space="preserve">3 zonas reales con tarifas de mercado: </w:t>
+        <w:t>3 real zones with market rates: Zone 1 Centre (XCG 5, free ≥75) · Zone 2 East (XCG 10, free ≥100) · Zone 3 West and North (XCG 25, free ≥150).</w:t>
       </w:r>
       <w:r>
         <w:rPr>
@@ -6899,7 +6894,6 @@
           <w:szCs w:val="21"/>
           <w:rFonts w:ascii="Calibri" w:cs="Calibri" w:eastAsia="Calibri" w:hAnsi="Calibri"/>
         </w:rPr>
-        <w:t xml:space="preserve">Zona 1 Centro (XCG 5, gratis ≥75) · Zona 2 Este (XCG 10, gratis ≥100) · Zona 3 Oeste y Norte (XCG 25, gratis ≥150).</w:t>
       </w:r>
     </w:p>
     <w:p>
@@ -6922,7 +6916,7 @@
           <w:szCs w:val="21"/>
           <w:rFonts w:ascii="Calibri" w:cs="Calibri" w:eastAsia="Calibri" w:hAnsi="Calibri"/>
         </w:rPr>
-        <w:t xml:space="preserve">Auto-detección por GPS: </w:t>
+        <w:t>GPS auto-detection: the "Detect my zone" button locates the customer and tells them their zone and fee.</w:t>
       </w:r>
       <w:r>
         <w:rPr>
@@ -6935,7 +6929,6 @@
           <w:szCs w:val="21"/>
           <w:rFonts w:ascii="Calibri" w:cs="Calibri" w:eastAsia="Calibri" w:hAnsi="Calibri"/>
         </w:rPr>
-        <w:t xml:space="preserve">el botón "Detectar mi zona" ubica al cliente y le dice su zona y tarifa.</w:t>
       </w:r>
     </w:p>
     <w:p>
@@ -6958,7 +6951,7 @@
           <w:szCs w:val="21"/>
           <w:rFonts w:ascii="Calibri" w:cs="Calibri" w:eastAsia="Calibri" w:hAnsi="Calibri"/>
         </w:rPr>
-        <w:t xml:space="preserve">Autocompletado de dirección: </w:t>
+        <w:t>Address autocomplete: as the street is typed, it suggests real Curaçao addresses and detects the zone automatically.</w:t>
       </w:r>
       <w:r>
         <w:rPr>
@@ -6971,7 +6964,6 @@
           <w:szCs w:val="21"/>
           <w:rFonts w:ascii="Calibri" w:cs="Calibri" w:eastAsia="Calibri" w:hAnsi="Calibri"/>
         </w:rPr>
-        <w:t xml:space="preserve">al escribir la calle, sugiere direcciones reales de Curaçao y detecta la zona automáticamente.</w:t>
       </w:r>
     </w:p>
     <w:p>
@@ -6994,7 +6986,7 @@
           <w:szCs w:val="21"/>
           <w:rFonts w:ascii="Calibri" w:cs="Calibri" w:eastAsia="Calibri" w:hAnsi="Calibri"/>
         </w:rPr>
-        <w:t xml:space="preserve">Cálculo de tarifa y envío gratis por zona </w:t>
+        <w:t>Fee calculation and free shipping per zone based on the cart subtotal, shown at checkout.</w:t>
       </w:r>
       <w:r>
         <w:rPr>
@@ -7007,7 +6999,6 @@
           <w:szCs w:val="21"/>
           <w:rFonts w:ascii="Calibri" w:cs="Calibri" w:eastAsia="Calibri" w:hAnsi="Calibri"/>
         </w:rPr>
-        <w:t xml:space="preserve">según el subtotal del carrito, mostrado en el checkout.</w:t>
       </w:r>
     </w:p>
     <w:p>
@@ -7030,7 +7021,7 @@
           <w:szCs w:val="21"/>
           <w:rFonts w:ascii="Calibri" w:cs="Calibri" w:eastAsia="Calibri" w:hAnsi="Calibri"/>
         </w:rPr>
-        <w:t xml:space="preserve">Cada barrio catalogado: </w:t>
+        <w:t>Every neighbourhood catalogued: Willemstad, Punda, Otrobanda, Jan Thiel, Blue Bay, Banda Abou, Banda Ariba, etc.</w:t>
       </w:r>
       <w:r>
         <w:rPr>
@@ -7043,7 +7034,6 @@
           <w:szCs w:val="21"/>
           <w:rFonts w:ascii="Calibri" w:cs="Calibri" w:eastAsia="Calibri" w:hAnsi="Calibri"/>
         </w:rPr>
-        <w:t xml:space="preserve">Willemstad, Punda, Otrobanda, Jan Thiel, Blue Bay, Banda Abou, Banda Ariba, etc.</w:t>
       </w:r>
     </w:p>
     <w:p>
@@ -7066,7 +7056,7 @@
           <w:szCs w:val="21"/>
           <w:rFonts w:ascii="Calibri" w:cs="Calibri" w:eastAsia="Calibri" w:hAnsi="Calibri"/>
         </w:rPr>
-        <w:t xml:space="preserve">La orden guarda la zona y las coordenadas </w:t>
+        <w:t>The order stores the zone and coordinates (lat/lng) for future logistics.</w:t>
       </w:r>
       <w:r>
         <w:rPr>
@@ -7079,7 +7069,6 @@
           <w:szCs w:val="21"/>
           <w:rFonts w:ascii="Calibri" w:cs="Calibri" w:eastAsia="Calibri" w:hAnsi="Calibri"/>
         </w:rPr>
-        <w:t xml:space="preserve">(lat/lng) para logística futura.</w:t>
       </w:r>
     </w:p>
     <w:p>
@@ -7096,7 +7085,7 @@
           <w:szCs w:val="25"/>
           <w:rFonts w:ascii="Georgia" w:cs="Georgia" w:eastAsia="Georgia" w:hAnsi="Georgia"/>
         </w:rPr>
-        <w:t xml:space="preserve">6.2 Las 3 zonas de un vistazo</w:t>
+        <w:t>6.2 The 3 zones at a glance</w:t>
       </w:r>
     </w:p>
     <w:tbl>
@@ -7147,7 +7136,7 @@
                 <w:szCs w:val="18"/>
                 <w:rFonts w:ascii="Calibri" w:cs="Calibri" w:eastAsia="Calibri" w:hAnsi="Calibri"/>
               </w:rPr>
-              <w:t xml:space="preserve">Zona</w:t>
+              <w:t>Zone</w:t>
             </w:r>
           </w:p>
         </w:tc>
@@ -7176,7 +7165,7 @@
                 <w:szCs w:val="18"/>
                 <w:rFonts w:ascii="Calibri" w:cs="Calibri" w:eastAsia="Calibri" w:hAnsi="Calibri"/>
               </w:rPr>
-              <w:t xml:space="preserve">Tarifa</w:t>
+              <w:t>Fee</w:t>
             </w:r>
           </w:p>
         </w:tc>
@@ -7205,7 +7194,7 @@
                 <w:szCs w:val="18"/>
                 <w:rFonts w:ascii="Calibri" w:cs="Calibri" w:eastAsia="Calibri" w:hAnsi="Calibri"/>
               </w:rPr>
-              <w:t xml:space="preserve">Envío gratis desde</w:t>
+              <w:t>Free shipping from</w:t>
             </w:r>
           </w:p>
         </w:tc>
@@ -7234,7 +7223,7 @@
                 <w:szCs w:val="18"/>
                 <w:rFonts w:ascii="Calibri" w:cs="Calibri" w:eastAsia="Calibri" w:hAnsi="Calibri"/>
               </w:rPr>
-              <w:t xml:space="preserve">Tiempo estimado</w:t>
+              <w:t>Estimated time</w:t>
             </w:r>
           </w:p>
         </w:tc>
@@ -7263,7 +7252,7 @@
                 <w:szCs w:val="18"/>
                 <w:rFonts w:ascii="Calibri" w:cs="Calibri" w:eastAsia="Calibri" w:hAnsi="Calibri"/>
               </w:rPr>
-              <w:t xml:space="preserve">Barrios (ejemplos)</w:t>
+              <w:t>Neighbourhoods (examples)</w:t>
             </w:r>
           </w:p>
         </w:tc>
@@ -7294,7 +7283,7 @@
                 <w:szCs w:val="18"/>
                 <w:rFonts w:ascii="Calibri" w:cs="Calibri" w:eastAsia="Calibri" w:hAnsi="Calibri"/>
               </w:rPr>
-              <w:t xml:space="preserve">1 — Centro</w:t>
+              <w:t>1 — Centre</w:t>
             </w:r>
           </w:p>
         </w:tc>
@@ -7323,7 +7312,7 @@
                 <w:szCs w:val="18"/>
                 <w:rFonts w:ascii="Calibri" w:cs="Calibri" w:eastAsia="Calibri" w:hAnsi="Calibri"/>
               </w:rPr>
-              <w:t xml:space="preserve">XCG 5</w:t>
+              <w:t>XCG 5</w:t>
             </w:r>
           </w:p>
         </w:tc>
@@ -7352,7 +7341,7 @@
                 <w:szCs w:val="18"/>
                 <w:rFonts w:ascii="Calibri" w:cs="Calibri" w:eastAsia="Calibri" w:hAnsi="Calibri"/>
               </w:rPr>
-              <w:t xml:space="preserve">XCG 75</w:t>
+              <w:t>XCG 75</w:t>
             </w:r>
           </w:p>
         </w:tc>
@@ -7381,7 +7370,7 @@
                 <w:szCs w:val="18"/>
                 <w:rFonts w:ascii="Calibri" w:cs="Calibri" w:eastAsia="Calibri" w:hAnsi="Calibri"/>
               </w:rPr>
-              <w:t xml:space="preserve">1–2 días</w:t>
+              <w:t>1–2 days</w:t>
             </w:r>
           </w:p>
         </w:tc>
@@ -7410,7 +7399,7 @@
                 <w:szCs w:val="18"/>
                 <w:rFonts w:ascii="Calibri" w:cs="Calibri" w:eastAsia="Calibri" w:hAnsi="Calibri"/>
               </w:rPr>
-              <w:t xml:space="preserve">Willemstad, Punda, Otrobanda, Pietermaai, Scharloo</w:t>
+              <w:t>Willemstad, Punda, Otrobanda, Pietermaai, Scharloo</w:t>
             </w:r>
           </w:p>
         </w:tc>
@@ -7441,7 +7430,7 @@
                 <w:szCs w:val="18"/>
                 <w:rFonts w:ascii="Calibri" w:cs="Calibri" w:eastAsia="Calibri" w:hAnsi="Calibri"/>
               </w:rPr>
-              <w:t xml:space="preserve">2 — Este</w:t>
+              <w:t>2 — East</w:t>
             </w:r>
           </w:p>
         </w:tc>
@@ -7470,7 +7459,7 @@
                 <w:szCs w:val="18"/>
                 <w:rFonts w:ascii="Calibri" w:cs="Calibri" w:eastAsia="Calibri" w:hAnsi="Calibri"/>
               </w:rPr>
-              <w:t xml:space="preserve">XCG 10</w:t>
+              <w:t>XCG 10</w:t>
             </w:r>
           </w:p>
         </w:tc>
@@ -7499,7 +7488,7 @@
                 <w:szCs w:val="18"/>
                 <w:rFonts w:ascii="Calibri" w:cs="Calibri" w:eastAsia="Calibri" w:hAnsi="Calibri"/>
               </w:rPr>
-              <w:t xml:space="preserve">XCG 100</w:t>
+              <w:t>XCG 100</w:t>
             </w:r>
           </w:p>
         </w:tc>
@@ -7528,7 +7517,7 @@
                 <w:szCs w:val="18"/>
                 <w:rFonts w:ascii="Calibri" w:cs="Calibri" w:eastAsia="Calibri" w:hAnsi="Calibri"/>
               </w:rPr>
-              <w:t xml:space="preserve">1–2 días</w:t>
+              <w:t>1–2 days</w:t>
             </w:r>
           </w:p>
         </w:tc>
@@ -7557,7 +7546,7 @@
                 <w:szCs w:val="18"/>
                 <w:rFonts w:ascii="Calibri" w:cs="Calibri" w:eastAsia="Calibri" w:hAnsi="Calibri"/>
               </w:rPr>
-              <w:t xml:space="preserve">Jan Thiel, Blue Bay, Saliña, Mahaai, Cas Grandi</w:t>
+              <w:t>Jan Thiel, Blue Bay, Saliña, Mahaai, Cas Grandi</w:t>
             </w:r>
           </w:p>
         </w:tc>
@@ -7588,7 +7577,7 @@
                 <w:szCs w:val="18"/>
                 <w:rFonts w:ascii="Calibri" w:cs="Calibri" w:eastAsia="Calibri" w:hAnsi="Calibri"/>
               </w:rPr>
-              <w:t xml:space="preserve">3 — Oeste y Norte</w:t>
+              <w:t>3 — West and North</w:t>
             </w:r>
           </w:p>
         </w:tc>
@@ -7617,7 +7606,7 @@
                 <w:szCs w:val="18"/>
                 <w:rFonts w:ascii="Calibri" w:cs="Calibri" w:eastAsia="Calibri" w:hAnsi="Calibri"/>
               </w:rPr>
-              <w:t xml:space="preserve">XCG 25</w:t>
+              <w:t>XCG 25</w:t>
             </w:r>
           </w:p>
         </w:tc>
@@ -7646,7 +7635,7 @@
                 <w:szCs w:val="18"/>
                 <w:rFonts w:ascii="Calibri" w:cs="Calibri" w:eastAsia="Calibri" w:hAnsi="Calibri"/>
               </w:rPr>
-              <w:t xml:space="preserve">XCG 150</w:t>
+              <w:t>XCG 150</w:t>
             </w:r>
           </w:p>
         </w:tc>
@@ -7675,7 +7664,7 @@
                 <w:szCs w:val="18"/>
                 <w:rFonts w:ascii="Calibri" w:cs="Calibri" w:eastAsia="Calibri" w:hAnsi="Calibri"/>
               </w:rPr>
-              <w:t xml:space="preserve">2–3 días</w:t>
+              <w:t>2–3 days</w:t>
             </w:r>
           </w:p>
         </w:tc>
@@ -7704,7 +7693,7 @@
                 <w:szCs w:val="18"/>
                 <w:rFonts w:ascii="Calibri" w:cs="Calibri" w:eastAsia="Calibri" w:hAnsi="Calibri"/>
               </w:rPr>
-              <w:t xml:space="preserve">Banda Abou, Banda Ariba, Tera Kòrá, Groot Kwartier</w:t>
+              <w:t>Banda Abou, Banda Ariba, Tera Kòrá, Groot Kwartier</w:t>
             </w:r>
           </w:p>
         </w:tc>
@@ -7758,7 +7747,7 @@
                 <w:szCs w:val="21"/>
                 <w:rFonts w:ascii="Calibri" w:cs="Calibri" w:eastAsia="Calibri" w:hAnsi="Calibri"/>
               </w:rPr>
-              <w:t xml:space="preserve">Lo que todavía NO existe en delivery (ver Documento 2)</w:t>
+              <w:t>What does NOT exist yet in delivery (see Document 2)</w:t>
             </w:r>
           </w:p>
           <w:p>
@@ -7772,7 +7761,7 @@
                 <w:szCs w:val="20"/>
                 <w:rFonts w:ascii="Calibri" w:cs="Calibri" w:eastAsia="Calibri" w:hAnsi="Calibri"/>
               </w:rPr>
-              <w:t xml:space="preserve">• Asignación de repartidor y despacho (¿quién entrega y cómo se le avisa?).</w:t>
+              <w:t>• Courier assignment and dispatch (who delivers and how are they notified?).</w:t>
             </w:r>
           </w:p>
           <w:p>
@@ -7786,7 +7775,7 @@
                 <w:szCs w:val="20"/>
                 <w:rFonts w:ascii="Calibri" w:cs="Calibri" w:eastAsia="Calibri" w:hAnsi="Calibri"/>
               </w:rPr>
-              <w:t xml:space="preserve">• Seguimiento en vivo para el cliente ("tu pedido va en camino" con estados).</w:t>
+              <w:t>• Live tracking for the customer ("your order is on its way" with statuses).</w:t>
             </w:r>
           </w:p>
           <w:p>
@@ -7800,7 +7789,7 @@
                 <w:szCs w:val="20"/>
                 <w:rFonts w:ascii="Calibri" w:cs="Calibri" w:eastAsia="Calibri" w:hAnsi="Calibri"/>
               </w:rPr>
-              <w:t xml:space="preserve">• Panel para que TÚ edites zonas y tarifas sin tocar código.</w:t>
+              <w:t>• A panel for YOU to edit zones and fees without touching code.</w:t>
             </w:r>
           </w:p>
           <w:p>
@@ -7814,7 +7803,7 @@
                 <w:szCs w:val="20"/>
                 <w:rFonts w:ascii="Calibri" w:cs="Calibri" w:eastAsia="Calibri" w:hAnsi="Calibri"/>
               </w:rPr>
-              <w:t xml:space="preserve">• Agenda / franjas horarias de entrega (elegir día y hora).</w:t>
+              <w:t>• Delivery schedule / time slots (choose day and time).</w:t>
             </w:r>
           </w:p>
           <w:p>
@@ -7828,7 +7817,7 @@
                 <w:szCs w:val="20"/>
                 <w:rFonts w:ascii="Calibri" w:cs="Calibri" w:eastAsia="Calibri" w:hAnsi="Calibri"/>
               </w:rPr>
-              <w:t xml:space="preserve">• Optimización de ruta cuando hay varios pedidos.</w:t>
+              <w:t>• Route optimisation when there are several orders.</w:t>
             </w:r>
           </w:p>
         </w:tc>
@@ -7856,7 +7845,7 @@
           <w:szCs w:val="30"/>
           <w:rFonts w:ascii="Georgia" w:cs="Georgia" w:eastAsia="Georgia" w:hAnsi="Georgia"/>
         </w:rPr>
-        <w:t xml:space="preserve">7. Base de datos y catálogo</w:t>
+        <w:t>7. Database and catalogue</w:t>
       </w:r>
     </w:p>
     <w:p>
@@ -7875,7 +7864,7 @@
           <w:szCs w:val="21"/>
           <w:rFonts w:ascii="Calibri" w:cs="Calibri" w:eastAsia="Calibri" w:hAnsi="Calibri"/>
         </w:rPr>
-        <w:t xml:space="preserve">La base de datos está diseñada para e-commerce serio: llaves únicas, marcas de tiempo automáticas, números de orden generados solos (UNI-AAMMDD-XXXX) y datos semilla precargados.</w:t>
+        <w:t>The database is designed for serious e-commerce: unique keys, automatic timestamps, auto-generated order numbers (UNI-AAMMDD-XXXX) and preloaded seed data.</w:t>
       </w:r>
     </w:p>
     <w:tbl>
@@ -7924,7 +7913,7 @@
                 <w:szCs w:val="18"/>
                 <w:rFonts w:ascii="Calibri" w:cs="Calibri" w:eastAsia="Calibri" w:hAnsi="Calibri"/>
               </w:rPr>
-              <w:t xml:space="preserve">Área</w:t>
+              <w:t>Area</w:t>
             </w:r>
           </w:p>
         </w:tc>
@@ -7953,7 +7942,7 @@
                 <w:szCs w:val="18"/>
                 <w:rFonts w:ascii="Calibri" w:cs="Calibri" w:eastAsia="Calibri" w:hAnsi="Calibri"/>
               </w:rPr>
-              <w:t xml:space="preserve">Contenido</w:t>
+              <w:t>Content</w:t>
             </w:r>
           </w:p>
         </w:tc>
@@ -7982,7 +7971,7 @@
                 <w:szCs w:val="18"/>
                 <w:rFonts w:ascii="Calibri" w:cs="Calibri" w:eastAsia="Calibri" w:hAnsi="Calibri"/>
               </w:rPr>
-              <w:t xml:space="preserve">Estado</w:t>
+              <w:t>Status</w:t>
             </w:r>
           </w:p>
         </w:tc>
@@ -8013,7 +8002,7 @@
                 <w:szCs w:val="18"/>
                 <w:rFonts w:ascii="Calibri" w:cs="Calibri" w:eastAsia="Calibri" w:hAnsi="Calibri"/>
               </w:rPr>
-              <w:t xml:space="preserve">Tablas principales</w:t>
+              <w:t>Main tables</w:t>
             </w:r>
           </w:p>
         </w:tc>
@@ -8042,7 +8031,7 @@
                 <w:szCs w:val="18"/>
                 <w:rFonts w:ascii="Calibri" w:cs="Calibri" w:eastAsia="Calibri" w:hAnsi="Calibri"/>
               </w:rPr>
-              <w:t xml:space="preserve">usuarios, direcciones, órdenes, ítems, pagos, carritos, reseñas, cupones, variantes, zonas de delivery, mensajes de WhatsApp</w:t>
+              <w:t>users, addresses, orders, items, payments, carts, reviews, coupons, variants, delivery zones, WhatsApp messages</w:t>
             </w:r>
           </w:p>
         </w:tc>
@@ -8071,7 +8060,7 @@
                 <w:szCs w:val="18"/>
                 <w:rFonts w:ascii="Calibri" w:cs="Calibri" w:eastAsia="Calibri" w:hAnsi="Calibri"/>
               </w:rPr>
-              <w:t xml:space="preserve">LISTO</w:t>
+              <w:t>READY</w:t>
             </w:r>
           </w:p>
         </w:tc>
@@ -8102,7 +8091,7 @@
                 <w:szCs w:val="18"/>
                 <w:rFonts w:ascii="Calibri" w:cs="Calibri" w:eastAsia="Calibri" w:hAnsi="Calibri"/>
               </w:rPr>
-              <w:t xml:space="preserve">Catálogo (Directus)</w:t>
+              <w:t>Catalogue (Directus)</w:t>
             </w:r>
           </w:p>
         </w:tc>
@@ -8131,7 +8120,7 @@
                 <w:szCs w:val="18"/>
                 <w:rFonts w:ascii="Calibri" w:cs="Calibri" w:eastAsia="Calibri" w:hAnsi="Calibri"/>
               </w:rPr>
-              <w:t xml:space="preserve">productos, categorías, marcas — editables desde el panel</w:t>
+              <w:t>products, categories, brands — editable from the panel</w:t>
             </w:r>
           </w:p>
         </w:tc>
@@ -8160,7 +8149,7 @@
                 <w:szCs w:val="18"/>
                 <w:rFonts w:ascii="Calibri" w:cs="Calibri" w:eastAsia="Calibri" w:hAnsi="Calibri"/>
               </w:rPr>
-              <w:t xml:space="preserve">LISTO</w:t>
+              <w:t>READY</w:t>
             </w:r>
           </w:p>
         </w:tc>
@@ -8191,7 +8180,7 @@
                 <w:szCs w:val="18"/>
                 <w:rFonts w:ascii="Calibri" w:cs="Calibri" w:eastAsia="Calibri" w:hAnsi="Calibri"/>
               </w:rPr>
-              <w:t xml:space="preserve">Productos cargados</w:t>
+              <w:t>Products loaded</w:t>
             </w:r>
           </w:p>
         </w:tc>
@@ -8220,7 +8209,7 @@
                 <w:szCs w:val="18"/>
                 <w:rFonts w:ascii="Calibri" w:cs="Calibri" w:eastAsia="Calibri" w:hAnsi="Calibri"/>
               </w:rPr>
-              <w:t xml:space="preserve">~285 productos (bras, panties, colonias, cremas, bloqueador, desodorantes, limpieza facial, accesorios)</w:t>
+              <w:t>~285 products (bras, panties, colognes, creams, sunscreen, deodorants, facial cleansing, accessories)</w:t>
             </w:r>
           </w:p>
         </w:tc>
@@ -8249,7 +8238,7 @@
                 <w:szCs w:val="18"/>
                 <w:rFonts w:ascii="Calibri" w:cs="Calibri" w:eastAsia="Calibri" w:hAnsi="Calibri"/>
               </w:rPr>
-              <w:t xml:space="preserve">LISTO</w:t>
+              <w:t>READY</w:t>
             </w:r>
           </w:p>
         </w:tc>
@@ -8280,7 +8269,7 @@
                 <w:szCs w:val="18"/>
                 <w:rFonts w:ascii="Calibri" w:cs="Calibri" w:eastAsia="Calibri" w:hAnsi="Calibri"/>
               </w:rPr>
-              <w:t xml:space="preserve">Cupones semilla</w:t>
+              <w:t>Seed coupons</w:t>
             </w:r>
           </w:p>
         </w:tc>
@@ -8309,7 +8298,7 @@
                 <w:szCs w:val="18"/>
                 <w:rFonts w:ascii="Calibri" w:cs="Calibri" w:eastAsia="Calibri" w:hAnsi="Calibri"/>
               </w:rPr>
-              <w:t xml:space="preserve">3 cupones de ejemplo precargados</w:t>
+              <w:t>3 preloaded sample coupons</w:t>
             </w:r>
           </w:p>
         </w:tc>
@@ -8338,7 +8327,7 @@
                 <w:szCs w:val="18"/>
                 <w:rFonts w:ascii="Calibri" w:cs="Calibri" w:eastAsia="Calibri" w:hAnsi="Calibri"/>
               </w:rPr>
-              <w:t xml:space="preserve">LISTO</w:t>
+              <w:t>READY</w:t>
             </w:r>
           </w:p>
         </w:tc>
@@ -8366,7 +8355,7 @@
           <w:szCs w:val="30"/>
           <w:rFonts w:ascii="Georgia" w:cs="Georgia" w:eastAsia="Georgia" w:hAnsi="Georgia"/>
         </w:rPr>
-        <w:t xml:space="preserve">8. Seguridad ya implementada</w:t>
+        <w:t>8. Security already implemented</w:t>
       </w:r>
     </w:p>
     <w:p>
@@ -8385,7 +8374,7 @@
           <w:szCs w:val="21"/>
           <w:rFonts w:ascii="Calibri" w:cs="Calibri" w:eastAsia="Calibri" w:hAnsi="Calibri"/>
         </w:rPr>
-        <w:t xml:space="preserve">El código ya trae buenas prácticas de seguridad. Esto es importante para proteger a tus clientes y su información.</w:t>
+        <w:t>The code already includes good security practices. This is important to protect your customers and their information.</w:t>
       </w:r>
     </w:p>
     <w:p>
@@ -8408,7 +8397,7 @@
           <w:szCs w:val="21"/>
           <w:rFonts w:ascii="Calibri" w:cs="Calibri" w:eastAsia="Calibri" w:hAnsi="Calibri"/>
         </w:rPr>
-        <w:t xml:space="preserve">Contraseñas encriptadas con bcrypt (nunca se guardan en texto plano).</w:t>
+        <w:t>Passwords encrypted with bcrypt (never stored in plain text).</w:t>
       </w:r>
     </w:p>
     <w:p>
@@ -8431,7 +8420,7 @@
           <w:szCs w:val="21"/>
           <w:rFonts w:ascii="Calibri" w:cs="Calibri" w:eastAsia="Calibri" w:hAnsi="Calibri"/>
         </w:rPr>
-        <w:t xml:space="preserve">Consultas a la base de datos protegidas contra inyección SQL.</w:t>
+        <w:t>Database queries protected against SQL injection.</w:t>
       </w:r>
     </w:p>
     <w:p>
@@ -8454,7 +8443,7 @@
           <w:szCs w:val="21"/>
           <w:rFonts w:ascii="Calibri" w:cs="Calibri" w:eastAsia="Calibri" w:hAnsi="Calibri"/>
         </w:rPr>
-        <w:t xml:space="preserve">Permisos de administrador verificados contra la base de datos (no solo confianza en el token).</w:t>
+        <w:t>Administrator permissions verified against the database (not just trusting the token).</w:t>
       </w:r>
     </w:p>
     <w:p>
@@ -8477,7 +8466,7 @@
           <w:szCs w:val="21"/>
           <w:rFonts w:ascii="Calibri" w:cs="Calibri" w:eastAsia="Calibri" w:hAnsi="Calibri"/>
         </w:rPr>
-        <w:t xml:space="preserve">Cabeceras de seguridad (Helmet), lista blanca de dominios (CORS) y límites de peticiones (anti-abuso).</w:t>
+        <w:t>Security headers (Helmet), domain allowlist (CORS) and request rate limits (anti-abuse).</w:t>
       </w:r>
     </w:p>
     <w:p>
@@ -8500,7 +8489,7 @@
           <w:szCs w:val="21"/>
           <w:rFonts w:ascii="Calibri" w:cs="Calibri" w:eastAsia="Calibri" w:hAnsi="Calibri"/>
         </w:rPr>
-        <w:t xml:space="preserve">Respuestas de login "a prueba de enumeración" (no revelan si un correo existe).</w:t>
+        <w:t>"Enumeration-proof" login responses (they do not reveal whether an email exists).</w:t>
       </w:r>
     </w:p>
     <w:p>
@@ -8523,7 +8512,7 @@
           <w:szCs w:val="21"/>
           <w:rFonts w:ascii="Calibri" w:cs="Calibri" w:eastAsia="Calibri" w:hAnsi="Calibri"/>
         </w:rPr>
-        <w:t xml:space="preserve">Checkout con transacciones y bloqueo de stock (no se vende lo que no hay).</w:t>
+        <w:t>Checkout with transactions and stock locking (it does not sell what is not in stock).</w:t>
       </w:r>
     </w:p>
     <w:p>
@@ -8546,7 +8535,7 @@
           <w:szCs w:val="21"/>
           <w:rFonts w:ascii="Calibri" w:cs="Calibri" w:eastAsia="Calibri" w:hAnsi="Calibri"/>
         </w:rPr>
-        <w:t xml:space="preserve">Webhook de pago que RE-VERIFICA el estado real con Sentoo (no confía en el mensaje entrante).</w:t>
+        <w:t>Payment webhook that RE-VERIFIES the real status with Sentoo (it does not trust the incoming message).</w:t>
       </w:r>
     </w:p>
     <w:p>
@@ -8597,7 +8586,7 @@
                 <w:szCs w:val="21"/>
                 <w:rFonts w:ascii="Calibri" w:cs="Calibri" w:eastAsia="Calibri" w:hAnsi="Calibri"/>
               </w:rPr>
-              <w:t xml:space="preserve">Pendientes de seguridad antes de lanzar (detalle en Documento 2)</w:t>
+              <w:t>Security items pending before launch (details in Document 2)</w:t>
             </w:r>
           </w:p>
           <w:p>
@@ -8611,7 +8600,7 @@
                 <w:szCs w:val="20"/>
                 <w:rFonts w:ascii="Calibri" w:cs="Calibri" w:eastAsia="Calibri" w:hAnsi="Calibri"/>
               </w:rPr>
-              <w:t xml:space="preserve">• Rotar la contraseña del administrador por defecto (viene con una de ejemplo en el código).</w:t>
+              <w:t>• Rotate the default administrator password (it ships with a sample one in the code).</w:t>
             </w:r>
           </w:p>
           <w:p>
@@ -8625,7 +8614,7 @@
                 <w:szCs w:val="20"/>
                 <w:rFonts w:ascii="Calibri" w:cs="Calibri" w:eastAsia="Calibri" w:hAnsi="Calibri"/>
               </w:rPr>
-              <w:t xml:space="preserve">• Poner el número de cuenta bancaria real para transferencias.</w:t>
+              <w:t>• Enter the real bank account number for transfers.</w:t>
             </w:r>
           </w:p>
           <w:p>
@@ -8639,7 +8628,7 @@
                 <w:szCs w:val="20"/>
                 <w:rFonts w:ascii="Calibri" w:cs="Calibri" w:eastAsia="Calibri" w:hAnsi="Calibri"/>
               </w:rPr>
-              <w:t xml:space="preserve">• Proteger la ruta /admin también del lado del servidor.</w:t>
+              <w:t>• Protect the /admin route on the server side as well.</w:t>
             </w:r>
           </w:p>
         </w:tc>
@@ -8667,7 +8656,7 @@
           <w:szCs w:val="30"/>
           <w:rFonts w:ascii="Georgia" w:cs="Georgia" w:eastAsia="Georgia" w:hAnsi="Georgia"/>
         </w:rPr>
-        <w:t xml:space="preserve">9. Conclusión</w:t>
+        <w:t>9. Conclusion</w:t>
       </w:r>
     </w:p>
     <w:p>
@@ -8686,7 +8675,7 @@
           <w:szCs w:val="21"/>
           <w:rFonts w:ascii="Calibri" w:cs="Calibri" w:eastAsia="Calibri" w:hAnsi="Calibri"/>
         </w:rPr>
-        <w:t xml:space="preserve">Unistyles no está empezando: está en la recta de acabado. </w:t>
+        <w:t xml:space="preserve">Unistyles is not just starting: it is on the home stretch. The code covers almost the entire journey of a real online store — catalogue, cart, checkout, payments, accounts, WhatsApp and a delivery system with a map and zones. </w:t>
       </w:r>
       <w:r>
         <w:rPr>
@@ -8699,7 +8688,6 @@
           <w:szCs w:val="21"/>
           <w:rFonts w:ascii="Calibri" w:cs="Calibri" w:eastAsia="Calibri" w:hAnsi="Calibri"/>
         </w:rPr>
-        <w:t xml:space="preserve">El código cubre casi todo el recorrido de una tienda online real — catálogo, carrito, checkout, pagos, cuentas, WhatsApp y un sistema de delivery con mapa y zonas. </w:t>
       </w:r>
     </w:p>
     <w:p>
@@ -8718,7 +8706,7 @@
           <w:szCs w:val="21"/>
           <w:rFonts w:ascii="Calibri" w:cs="Calibri" w:eastAsia="Calibri" w:hAnsi="Calibri"/>
         </w:rPr>
-        <w:t xml:space="preserve">El trabajo restante se concentra en: (1) confirmar que todos los servicios estén desplegados juntos, (2) corregir un puñado de errores y formularios sin conectar, (3) configurar las cuentas externas (Sentoo, WhatsApp, banco), y (4) definir la parte operativa del delivery. Todo eso está desglosado como user stories en el Documento 2.</w:t>
+        <w:t>The remaining work is concentrated on: (1) confirming that all services are deployed together, (2) fixing a handful of bugs and unconnected forms, (3) configuring the external accounts (Sentoo, WhatsApp, bank), and (4) defining the operational side of delivery. All of this is broken down as user stories in Document 2.</w:t>
       </w:r>
     </w:p>
     <w:p>
@@ -8769,7 +8757,7 @@
                 <w:szCs w:val="21"/>
                 <w:rFonts w:ascii="Calibri" w:cs="Calibri" w:eastAsia="Calibri" w:hAnsi="Calibri"/>
               </w:rPr>
-              <w:t xml:space="preserve">Cómo se conecta con tus otros documentos</w:t>
+              <w:t>How it connects with your other documents</w:t>
             </w:r>
           </w:p>
           <w:p>
@@ -8783,7 +8771,7 @@
                 <w:szCs w:val="20"/>
                 <w:rFonts w:ascii="Calibri" w:cs="Calibri" w:eastAsia="Calibri" w:hAnsi="Calibri"/>
               </w:rPr>
-              <w:t xml:space="preserve">• Documento 2 — Checklist de finalización: qué falta terminar (user stories + prioridad).</w:t>
+              <w:t>• Document 2 — Completion checklist: what remains to be finished (user stories + priority).</w:t>
             </w:r>
           </w:p>
           <w:p>
@@ -8797,7 +8785,7 @@
                 <w:szCs w:val="20"/>
                 <w:rFonts w:ascii="Calibri" w:cs="Calibri" w:eastAsia="Calibri" w:hAnsi="Calibri"/>
               </w:rPr>
-              <w:t xml:space="preserve">• Documento 3 — Checklist de research: qué investigar antes de decidir diseño/estrategia.</w:t>
+              <w:t>• Document 3 — Research checklist: what to research before deciding on design/strategy.</w:t>
             </w:r>
           </w:p>
           <w:p>
@@ -8811,7 +8799,7 @@
                 <w:szCs w:val="20"/>
                 <w:rFonts w:ascii="Calibri" w:cs="Calibri" w:eastAsia="Calibri" w:hAnsi="Calibri"/>
               </w:rPr>
-              <w:t xml:space="preserve">• Documento 4 — Deep research + brainstorming: preguntas para la sesión con tu equipo.</w:t>
+              <w:t>• Document 4 — Deep research + brainstorming: questions for the session with your team.</w:t>
             </w:r>
           </w:p>
           <w:p>
@@ -8825,7 +8813,7 @@
                 <w:szCs w:val="20"/>
                 <w:rFonts w:ascii="Calibri" w:cs="Calibri" w:eastAsia="Calibri" w:hAnsi="Calibri"/>
               </w:rPr>
-              <w:t xml:space="preserve">• Documento 5 — Action plan (Double Diamond): cómo organizar el trabajo por fases.</w:t>
+              <w:t>• Document 5 — Action plan (Double Diamond): how to organise the work in phases.</w:t>
             </w:r>
           </w:p>
         </w:tc>
@@ -8833,6 +8821,7 @@
     </w:tbl>
     <w:sectPr>
       <w:footerReference w:type="default" r:id="rId6"/>
+      <w:headerReference w:type="default" r:id="rId7"/>
       <w:pgSz w:w="11906" w:h="16838" w:orient="portrait"/>
       <w:pgMar w:top="1100" w:right="1440" w:bottom="1100" w:left="1440" w:header="708" w:footer="708" w:gutter="0"/>
       <w:pgNumType/>
@@ -8862,7 +8851,7 @@
         <w:szCs w:val="16"/>
         <w:rFonts w:ascii="Calibri" w:cs="Calibri" w:eastAsia="Calibri" w:hAnsi="Calibri"/>
       </w:rPr>
-      <w:t xml:space="preserve">Unistyles Curaçao  ·  </w:t>
+      <w:t xml:space="preserve">Unistyles Curaçao  ·  What is already done   ·   Page  / </w:t>
     </w:r>
     <w:r>
       <w:rPr>
@@ -8873,7 +8862,6 @@
         <w:szCs w:val="16"/>
         <w:rFonts w:ascii="Calibri" w:cs="Calibri" w:eastAsia="Calibri" w:hAnsi="Calibri"/>
       </w:rPr>
-      <w:t xml:space="preserve">Lo que ya está listo</w:t>
     </w:r>
     <w:r>
       <w:rPr>
@@ -8882,7 +8870,6 @@
         <w:szCs w:val="16"/>
         <w:rFonts w:ascii="Calibri" w:cs="Calibri" w:eastAsia="Calibri" w:hAnsi="Calibri"/>
       </w:rPr>
-      <w:t xml:space="preserve">   ·   </w:t>
     </w:r>
     <w:r>
       <w:rPr>
@@ -8891,16 +8878,6 @@
         <w:szCs w:val="16"/>
         <w:rFonts w:ascii="Calibri" w:cs="Calibri" w:eastAsia="Calibri" w:hAnsi="Calibri"/>
       </w:rPr>
-      <w:t xml:space="preserve">Pág. </w:t>
-      <w:fldChar w:fldCharType="begin"/>
-      <w:instrText xml:space="preserve">PAGE</w:instrText>
-      <w:fldChar w:fldCharType="separate"/>
-      <w:fldChar w:fldCharType="end"/>
-      <w:t xml:space="preserve"> / </w:t>
-      <w:fldChar w:fldCharType="begin"/>
-      <w:instrText xml:space="preserve">NUMPAGES</w:instrText>
-      <w:fldChar w:fldCharType="separate"/>
-      <w:fldChar w:fldCharType="end"/>
     </w:r>
   </w:p>
 </w:ftr>
@@ -8941,6 +8918,16 @@
     </w:p>
   </w:footnote>
 </w:footnotes>
+</file>
+
+<file path=word/header1.xml><?xml version="1.0" encoding="utf-8"?>
+<w:hdr xmlns:m="http://schemas.openxmlformats.org/officeDocument/2006/math" xmlns:mc="http://schemas.openxmlformats.org/markup-compatibility/2006" xmlns:mo="http://schemas.microsoft.com/office/mac/office/2008/main" xmlns:mv="urn:schemas-microsoft-com:mac:vml" xmlns:o="urn:schemas-microsoft-com:office:office" xmlns:r="http://schemas.openxmlformats.org/officeDocument/2006/relationships" xmlns:v="urn:schemas-microsoft-com:vml" xmlns:w10="urn:schemas-microsoft-com:office:word" xmlns:w14="http://schemas.microsoft.com/office/word/2010/wordml" xmlns:w="http://schemas.openxmlformats.org/wordprocessingml/2006/main" xmlns:wne="http://schemas.microsoft.com/office/word/2006/wordml" xmlns:wp14="http://schemas.microsoft.com/office/word/2010/wordprocessingDrawing" xmlns:wp="http://schemas.openxmlformats.org/drawingml/2006/wordprocessingDrawing" xmlns:wpc="http://schemas.microsoft.com/office/word/2010/wordprocessingCanvas" xmlns:wpg="http://schemas.microsoft.com/office/word/2010/wordprocessingGroup" xmlns:wpi="http://schemas.microsoft.com/office/word/2010/wordprocessingInk" xmlns:wps="http://schemas.microsoft.com/office/word/2010/wordprocessingShape" mc:Ignorable="w14 wp14">
+  <w:p>
+    <w:pPr>
+      <w:pStyle w:val="Header"/>
+    </w:pPr>
+  </w:p>
+</w:hdr>
 </file>
 
 <file path=word/numbering.xml><?xml version="1.0" encoding="utf-8"?>

</xml_diff>